<commit_message>
Add EF Core, ApplicationDbContext and DI setup
Prepare project for EF Core persistence: bump OpenAPI package, add Microsoft.EntityFrameworkCore.SqlServer to API and Infrastructure projects, and add EF Core package to Infrastructure. Introduce ApplicationDbContext (DbSet<Job>), add connection string to appsettings, and register DbContext pool and IJobRepository/JobRepository in Program.cs. Convert IJobRepository to a public interface with AddJob, implement JobRepository (stub), rename Configurations path, and remove the old placeholder DbContext. These changes wire up DI and DB configuration for future EF implementations.
</commit_message>
<xml_diff>
--- a/docs/Job board application using clean architecture.docx
+++ b/docs/Job board application using clean architecture.docx
@@ -1,6 +1,6 @@
 
 <file path=word/document.xml><?xml version="1.0" encoding="utf-8"?>
-<w:document xmlns:wpc="http://schemas.microsoft.com/office/word/2010/wordprocessingCanvas" xmlns:cx="http://schemas.microsoft.com/office/drawing/2014/chartex" xmlns:mc="http://schemas.openxmlformats.org/markup-compatibility/2006" xmlns:o="urn:schemas-microsoft-com:office:office" xmlns:r="http://schemas.openxmlformats.org/officeDocument/2006/relationships" xmlns:m="http://schemas.openxmlformats.org/officeDocument/2006/math" xmlns:v="urn:schemas-microsoft-com:vml" xmlns:wp14="http://schemas.microsoft.com/office/word/2010/wordprocessingDrawing" xmlns:wp="http://schemas.openxmlformats.org/drawingml/2006/wordprocessingDrawing" xmlns:w10="urn:schemas-microsoft-com:office:word" xmlns:w="http://schemas.openxmlformats.org/wordprocessingml/2006/main" xmlns:w14="http://schemas.microsoft.com/office/word/2010/wordml" xmlns:w15="http://schemas.microsoft.com/office/word/2012/wordml" xmlns:w16se="http://schemas.microsoft.com/office/word/2015/wordml/symex" xmlns:wpg="http://schemas.microsoft.com/office/word/2010/wordprocessingGroup" xmlns:wpi="http://schemas.microsoft.com/office/word/2010/wordprocessingInk" xmlns:wne="http://schemas.microsoft.com/office/word/2006/wordml" xmlns:wps="http://schemas.microsoft.com/office/word/2010/wordprocessingShape" mc:Ignorable="w14 w15 w16se wp14">
+<w:document xmlns:wpc="http://schemas.microsoft.com/office/word/2010/wordprocessingCanvas" xmlns:cx="http://schemas.microsoft.com/office/drawing/2014/chartex" xmlns:cx1="http://schemas.microsoft.com/office/drawing/2015/9/8/chartex" xmlns:cx2="http://schemas.microsoft.com/office/drawing/2015/10/21/chartex" xmlns:cx3="http://schemas.microsoft.com/office/drawing/2016/5/9/chartex" xmlns:cx4="http://schemas.microsoft.com/office/drawing/2016/5/10/chartex" xmlns:cx5="http://schemas.microsoft.com/office/drawing/2016/5/11/chartex" xmlns:cx6="http://schemas.microsoft.com/office/drawing/2016/5/12/chartex" xmlns:cx7="http://schemas.microsoft.com/office/drawing/2016/5/13/chartex" xmlns:cx8="http://schemas.microsoft.com/office/drawing/2016/5/14/chartex" xmlns:mc="http://schemas.openxmlformats.org/markup-compatibility/2006" xmlns:aink="http://schemas.microsoft.com/office/drawing/2016/ink" xmlns:am3d="http://schemas.microsoft.com/office/drawing/2017/model3d" xmlns:o="urn:schemas-microsoft-com:office:office" xmlns:r="http://schemas.openxmlformats.org/officeDocument/2006/relationships" xmlns:m="http://schemas.openxmlformats.org/officeDocument/2006/math" xmlns:v="urn:schemas-microsoft-com:vml" xmlns:wp14="http://schemas.microsoft.com/office/word/2010/wordprocessingDrawing" xmlns:wp="http://schemas.openxmlformats.org/drawingml/2006/wordprocessingDrawing" xmlns:w10="urn:schemas-microsoft-com:office:word" xmlns:w="http://schemas.openxmlformats.org/wordprocessingml/2006/main" xmlns:w14="http://schemas.microsoft.com/office/word/2010/wordml" xmlns:w15="http://schemas.microsoft.com/office/word/2012/wordml" xmlns:w16cid="http://schemas.microsoft.com/office/word/2016/wordml/cid" xmlns:w16se="http://schemas.microsoft.com/office/word/2015/wordml/symex" xmlns:wpg="http://schemas.microsoft.com/office/word/2010/wordprocessingGroup" xmlns:wpi="http://schemas.microsoft.com/office/word/2010/wordprocessingInk" xmlns:wne="http://schemas.microsoft.com/office/word/2006/wordml" xmlns:wps="http://schemas.microsoft.com/office/word/2010/wordprocessingShape" mc:Ignorable="w14 w15 w16se w16cid wp14">
   <w:body>
     <w:p>
       <w:r>
@@ -90,13 +90,7 @@
       </w:r>
       <w:proofErr w:type="spellEnd"/>
       <w:r>
-        <w:t xml:space="preserve"> (</w:t>
-      </w:r>
-      <w:r>
-        <w:t>library classes</w:t>
-      </w:r>
-      <w:r>
-        <w:t>)</w:t>
+        <w:t xml:space="preserve"> (library classes)</w:t>
       </w:r>
     </w:p>
     <w:p>
@@ -113,13 +107,7 @@
       </w:r>
       <w:proofErr w:type="spellEnd"/>
       <w:r>
-        <w:t>(</w:t>
-      </w:r>
-      <w:r>
-        <w:t>library classes</w:t>
-      </w:r>
-      <w:r>
-        <w:t>)</w:t>
+        <w:t>(library classes)</w:t>
       </w:r>
     </w:p>
     <w:p/>
@@ -398,8 +386,6 @@
       </w:r>
       <w:r>
         <w:br/>
-      </w:r>
-      <w:r>
         <w:t>HTTP POST</w:t>
       </w:r>
     </w:p>
@@ -942,15 +928,7 @@
         <w:ind w:left="360"/>
       </w:pPr>
       <w:r>
-        <w:t xml:space="preserve">API = Controllers, HTTP Requests and </w:t>
-      </w:r>
-      <w:proofErr w:type="spellStart"/>
-      <w:r>
-        <w:t>Auth</w:t>
-      </w:r>
-      <w:proofErr w:type="spellEnd"/>
-      <w:r>
-        <w:t xml:space="preserve"> logic</w:t>
+        <w:t>API = Controllers, HTTP Requests and Auth logic</w:t>
       </w:r>
     </w:p>
     <w:p>
@@ -1123,6 +1101,1421 @@
           <w:rFonts w:ascii="Calibri" w:hAnsi="Calibri" w:cs="Calibri"/>
         </w:rPr>
         <w:t>───┘</w:t>
+      </w:r>
+    </w:p>
+    <w:p>
+      <w:pPr>
+        <w:ind w:left="360"/>
+      </w:pPr>
+    </w:p>
+    <w:p>
+      <w:pPr>
+        <w:ind w:left="360"/>
+      </w:pPr>
+    </w:p>
+    <w:p>
+      <w:pPr>
+        <w:ind w:left="360"/>
+      </w:pPr>
+    </w:p>
+    <w:p>
+      <w:pPr>
+        <w:spacing w:before="100" w:beforeAutospacing="1" w:after="100" w:afterAutospacing="1" w:line="240" w:lineRule="auto"/>
+        <w:outlineLvl w:val="0"/>
+        <w:rPr>
+          <w:rFonts w:ascii="Times New Roman" w:eastAsia="Times New Roman" w:hAnsi="Times New Roman" w:cs="Times New Roman"/>
+          <w:b/>
+          <w:bCs/>
+          <w:kern w:val="36"/>
+          <w:sz w:val="48"/>
+          <w:szCs w:val="48"/>
+        </w:rPr>
+      </w:pPr>
+      <w:r>
+        <w:rPr>
+          <w:rFonts w:ascii="Times New Roman" w:eastAsia="Times New Roman" w:hAnsi="Times New Roman" w:cs="Times New Roman"/>
+          <w:b/>
+          <w:bCs/>
+          <w:kern w:val="36"/>
+          <w:sz w:val="48"/>
+          <w:szCs w:val="48"/>
+        </w:rPr>
+        <w:t>Your roadmap from here</w:t>
+      </w:r>
+    </w:p>
+    <w:p>
+      <w:pPr>
+        <w:spacing w:before="100" w:beforeAutospacing="1" w:after="100" w:afterAutospacing="1" w:line="240" w:lineRule="auto"/>
+        <w:rPr>
+          <w:rFonts w:ascii="Times New Roman" w:eastAsia="Times New Roman" w:hAnsi="Times New Roman" w:cs="Times New Roman"/>
+          <w:sz w:val="24"/>
+          <w:szCs w:val="24"/>
+        </w:rPr>
+      </w:pPr>
+      <w:r>
+        <w:rPr>
+          <w:rFonts w:ascii="Times New Roman" w:eastAsia="Times New Roman" w:hAnsi="Times New Roman" w:cs="Times New Roman"/>
+          <w:sz w:val="24"/>
+          <w:szCs w:val="24"/>
+        </w:rPr>
+        <w:t>When you come back, don't jump straight into controllers.</w:t>
+      </w:r>
+    </w:p>
+    <w:p>
+      <w:pPr>
+        <w:spacing w:before="100" w:beforeAutospacing="1" w:after="100" w:afterAutospacing="1" w:line="240" w:lineRule="auto"/>
+        <w:outlineLvl w:val="2"/>
+        <w:rPr>
+          <w:rFonts w:ascii="Times New Roman" w:eastAsia="Times New Roman" w:hAnsi="Times New Roman" w:cs="Times New Roman"/>
+          <w:b/>
+          <w:bCs/>
+          <w:sz w:val="27"/>
+          <w:szCs w:val="27"/>
+        </w:rPr>
+      </w:pPr>
+      <w:r>
+        <w:rPr>
+          <w:rFonts w:ascii="Segoe UI Emoji" w:eastAsia="Times New Roman" w:hAnsi="Segoe UI Emoji" w:cs="Segoe UI Emoji"/>
+          <w:b/>
+          <w:bCs/>
+          <w:sz w:val="27"/>
+          <w:szCs w:val="27"/>
+        </w:rPr>
+        <w:t>✅</w:t>
+      </w:r>
+      <w:r>
+        <w:rPr>
+          <w:rFonts w:ascii="Times New Roman" w:eastAsia="Times New Roman" w:hAnsi="Times New Roman" w:cs="Times New Roman"/>
+          <w:b/>
+          <w:bCs/>
+          <w:sz w:val="27"/>
+          <w:szCs w:val="27"/>
+        </w:rPr>
+        <w:t xml:space="preserve"> Foundation completed</w:t>
+      </w:r>
+    </w:p>
+    <w:p>
+      <w:pPr>
+        <w:numPr>
+          <w:ilvl w:val="0"/>
+          <w:numId w:val="5"/>
+        </w:numPr>
+        <w:spacing w:before="100" w:beforeAutospacing="1" w:after="100" w:afterAutospacing="1" w:line="240" w:lineRule="auto"/>
+        <w:rPr>
+          <w:rFonts w:ascii="Times New Roman" w:eastAsia="Times New Roman" w:hAnsi="Times New Roman" w:cs="Times New Roman"/>
+          <w:sz w:val="24"/>
+          <w:szCs w:val="24"/>
+        </w:rPr>
+      </w:pPr>
+      <w:r>
+        <w:rPr>
+          <w:rFonts w:ascii="Times New Roman" w:eastAsia="Times New Roman" w:hAnsi="Times New Roman" w:cs="Times New Roman"/>
+          <w:sz w:val="24"/>
+          <w:szCs w:val="24"/>
+        </w:rPr>
+        <w:object w:dxaOrig="225" w:dyaOrig="225">
+          <v:shapetype id="_x0000_t75" coordsize="21600,21600" o:spt="75" o:preferrelative="t" path="m@4@5l@4@11@9@11@9@5xe" filled="f" stroked="f">
+            <v:stroke joinstyle="miter"/>
+            <v:formulas>
+              <v:f eqn="if lineDrawn pixelLineWidth 0"/>
+              <v:f eqn="sum @0 1 0"/>
+              <v:f eqn="sum 0 0 @1"/>
+              <v:f eqn="prod @2 1 2"/>
+              <v:f eqn="prod @3 21600 pixelWidth"/>
+              <v:f eqn="prod @3 21600 pixelHeight"/>
+              <v:f eqn="sum @0 0 1"/>
+              <v:f eqn="prod @6 1 2"/>
+              <v:f eqn="prod @7 21600 pixelWidth"/>
+              <v:f eqn="sum @8 21600 0"/>
+              <v:f eqn="prod @7 21600 pixelHeight"/>
+              <v:f eqn="sum @10 21600 0"/>
+            </v:formulas>
+            <v:path o:extrusionok="f" gradientshapeok="t" o:connecttype="rect"/>
+            <o:lock v:ext="edit" aspectratio="t"/>
+          </v:shapetype>
+          <v:shape id="_x0000_i1060" type="#_x0000_t75" style="width:18pt;height:15.6pt" o:ole="">
+            <v:imagedata r:id="rId5" o:title=""/>
+          </v:shape>
+          <w:control r:id="rId6" w:name="DefaultOcxName" w:shapeid="_x0000_i1060"/>
+        </w:object>
+      </w:r>
+      <w:r>
+        <w:rPr>
+          <w:rFonts w:ascii="Times New Roman" w:eastAsia="Times New Roman" w:hAnsi="Times New Roman" w:cs="Times New Roman"/>
+          <w:sz w:val="24"/>
+          <w:szCs w:val="24"/>
+        </w:rPr>
+        <w:t xml:space="preserve">Web API project </w:t>
+      </w:r>
+    </w:p>
+    <w:p>
+      <w:pPr>
+        <w:numPr>
+          <w:ilvl w:val="0"/>
+          <w:numId w:val="5"/>
+        </w:numPr>
+        <w:spacing w:before="100" w:beforeAutospacing="1" w:after="100" w:afterAutospacing="1" w:line="240" w:lineRule="auto"/>
+        <w:rPr>
+          <w:rFonts w:ascii="Times New Roman" w:eastAsia="Times New Roman" w:hAnsi="Times New Roman" w:cs="Times New Roman"/>
+          <w:sz w:val="24"/>
+          <w:szCs w:val="24"/>
+        </w:rPr>
+      </w:pPr>
+      <w:r>
+        <w:rPr>
+          <w:rFonts w:ascii="Times New Roman" w:eastAsia="Times New Roman" w:hAnsi="Times New Roman" w:cs="Times New Roman"/>
+          <w:sz w:val="24"/>
+          <w:szCs w:val="24"/>
+        </w:rPr>
+        <w:object w:dxaOrig="225" w:dyaOrig="225">
+          <v:shape id="_x0000_i1059" type="#_x0000_t75" style="width:18pt;height:15.6pt" o:ole="">
+            <v:imagedata r:id="rId5" o:title=""/>
+          </v:shape>
+          <w:control r:id="rId7" w:name="DefaultOcxName1" w:shapeid="_x0000_i1059"/>
+        </w:object>
+      </w:r>
+      <w:r>
+        <w:rPr>
+          <w:rFonts w:ascii="Times New Roman" w:eastAsia="Times New Roman" w:hAnsi="Times New Roman" w:cs="Times New Roman"/>
+          <w:sz w:val="24"/>
+          <w:szCs w:val="24"/>
+        </w:rPr>
+        <w:t xml:space="preserve">Four-project Clean Architecture </w:t>
+      </w:r>
+    </w:p>
+    <w:p>
+      <w:pPr>
+        <w:numPr>
+          <w:ilvl w:val="0"/>
+          <w:numId w:val="5"/>
+        </w:numPr>
+        <w:spacing w:before="100" w:beforeAutospacing="1" w:after="100" w:afterAutospacing="1" w:line="240" w:lineRule="auto"/>
+        <w:rPr>
+          <w:rFonts w:ascii="Times New Roman" w:eastAsia="Times New Roman" w:hAnsi="Times New Roman" w:cs="Times New Roman"/>
+          <w:sz w:val="24"/>
+          <w:szCs w:val="24"/>
+        </w:rPr>
+      </w:pPr>
+      <w:r>
+        <w:rPr>
+          <w:rFonts w:ascii="Times New Roman" w:eastAsia="Times New Roman" w:hAnsi="Times New Roman" w:cs="Times New Roman"/>
+          <w:sz w:val="24"/>
+          <w:szCs w:val="24"/>
+        </w:rPr>
+        <w:object w:dxaOrig="225" w:dyaOrig="225">
+          <v:shape id="_x0000_i1058" type="#_x0000_t75" style="width:18pt;height:15.6pt" o:ole="">
+            <v:imagedata r:id="rId5" o:title=""/>
+          </v:shape>
+          <w:control r:id="rId8" w:name="DefaultOcxName2" w:shapeid="_x0000_i1058"/>
+        </w:object>
+      </w:r>
+      <w:r>
+        <w:rPr>
+          <w:rFonts w:ascii="Times New Roman" w:eastAsia="Times New Roman" w:hAnsi="Times New Roman" w:cs="Times New Roman"/>
+          <w:sz w:val="24"/>
+          <w:szCs w:val="24"/>
+        </w:rPr>
+        <w:t xml:space="preserve">Project references </w:t>
+      </w:r>
+    </w:p>
+    <w:proofErr w:type="gramStart"/>
+    <w:p>
+      <w:pPr>
+        <w:numPr>
+          <w:ilvl w:val="0"/>
+          <w:numId w:val="5"/>
+        </w:numPr>
+        <w:spacing w:before="100" w:beforeAutospacing="1" w:after="100" w:afterAutospacing="1" w:line="240" w:lineRule="auto"/>
+        <w:rPr>
+          <w:rFonts w:ascii="Times New Roman" w:eastAsia="Times New Roman" w:hAnsi="Times New Roman" w:cs="Times New Roman"/>
+          <w:sz w:val="24"/>
+          <w:szCs w:val="24"/>
+        </w:rPr>
+      </w:pPr>
+      <w:r>
+        <w:rPr>
+          <w:rFonts w:ascii="Times New Roman" w:eastAsia="Times New Roman" w:hAnsi="Times New Roman" w:cs="Times New Roman"/>
+          <w:sz w:val="24"/>
+          <w:szCs w:val="24"/>
+        </w:rPr>
+        <w:object w:dxaOrig="225" w:dyaOrig="225">
+          <v:shape id="_x0000_i1057" type="#_x0000_t75" style="width:18pt;height:15.6pt" o:ole="">
+            <v:imagedata r:id="rId5" o:title=""/>
+          </v:shape>
+          <w:control r:id="rId9" w:name="DefaultOcxName3" w:shapeid="_x0000_i1057"/>
+        </w:object>
+      </w:r>
+      <w:r>
+        <w:rPr>
+          <w:rFonts w:ascii="Courier New" w:eastAsia="Times New Roman" w:hAnsi="Courier New" w:cs="Courier New"/>
+          <w:sz w:val="20"/>
+          <w:szCs w:val="20"/>
+        </w:rPr>
+        <w:t>.</w:t>
+      </w:r>
+      <w:proofErr w:type="spellStart"/>
+      <w:r>
+        <w:rPr>
+          <w:rFonts w:ascii="Courier New" w:eastAsia="Times New Roman" w:hAnsi="Courier New" w:cs="Courier New"/>
+          <w:sz w:val="20"/>
+          <w:szCs w:val="20"/>
+        </w:rPr>
+        <w:t>gitignore</w:t>
+      </w:r>
+      <w:proofErr w:type="spellEnd"/>
+      <w:proofErr w:type="gramEnd"/>
+      <w:r>
+        <w:rPr>
+          <w:rFonts w:ascii="Times New Roman" w:eastAsia="Times New Roman" w:hAnsi="Times New Roman" w:cs="Times New Roman"/>
+          <w:sz w:val="24"/>
+          <w:szCs w:val="24"/>
+        </w:rPr>
+        <w:t xml:space="preserve"> </w:t>
+      </w:r>
+    </w:p>
+    <w:p>
+      <w:pPr>
+        <w:numPr>
+          <w:ilvl w:val="0"/>
+          <w:numId w:val="5"/>
+        </w:numPr>
+        <w:spacing w:before="100" w:beforeAutospacing="1" w:after="100" w:afterAutospacing="1" w:line="240" w:lineRule="auto"/>
+        <w:rPr>
+          <w:rFonts w:ascii="Times New Roman" w:eastAsia="Times New Roman" w:hAnsi="Times New Roman" w:cs="Times New Roman"/>
+          <w:sz w:val="24"/>
+          <w:szCs w:val="24"/>
+        </w:rPr>
+      </w:pPr>
+      <w:r>
+        <w:rPr>
+          <w:rFonts w:ascii="Times New Roman" w:eastAsia="Times New Roman" w:hAnsi="Times New Roman" w:cs="Times New Roman"/>
+          <w:sz w:val="24"/>
+          <w:szCs w:val="24"/>
+        </w:rPr>
+        <w:object w:dxaOrig="225" w:dyaOrig="225">
+          <v:shape id="_x0000_i1056" type="#_x0000_t75" style="width:18pt;height:15.6pt" o:ole="">
+            <v:imagedata r:id="rId5" o:title=""/>
+          </v:shape>
+          <w:control r:id="rId10" w:name="DefaultOcxName4" w:shapeid="_x0000_i1056"/>
+        </w:object>
+      </w:r>
+      <w:r>
+        <w:rPr>
+          <w:rFonts w:ascii="Courier New" w:eastAsia="Times New Roman" w:hAnsi="Courier New" w:cs="Courier New"/>
+          <w:sz w:val="20"/>
+          <w:szCs w:val="20"/>
+        </w:rPr>
+        <w:t>Job</w:t>
+      </w:r>
+      <w:r>
+        <w:rPr>
+          <w:rFonts w:ascii="Times New Roman" w:eastAsia="Times New Roman" w:hAnsi="Times New Roman" w:cs="Times New Roman"/>
+          <w:sz w:val="24"/>
+          <w:szCs w:val="24"/>
+        </w:rPr>
+        <w:t xml:space="preserve"> entity </w:t>
+      </w:r>
+    </w:p>
+    <w:p>
+      <w:pPr>
+        <w:numPr>
+          <w:ilvl w:val="0"/>
+          <w:numId w:val="5"/>
+        </w:numPr>
+        <w:spacing w:before="100" w:beforeAutospacing="1" w:after="100" w:afterAutospacing="1" w:line="240" w:lineRule="auto"/>
+        <w:rPr>
+          <w:rFonts w:ascii="Times New Roman" w:eastAsia="Times New Roman" w:hAnsi="Times New Roman" w:cs="Times New Roman"/>
+          <w:sz w:val="24"/>
+          <w:szCs w:val="24"/>
+        </w:rPr>
+      </w:pPr>
+      <w:r>
+        <w:rPr>
+          <w:rFonts w:ascii="Times New Roman" w:eastAsia="Times New Roman" w:hAnsi="Times New Roman" w:cs="Times New Roman"/>
+          <w:sz w:val="24"/>
+          <w:szCs w:val="24"/>
+        </w:rPr>
+        <w:object w:dxaOrig="225" w:dyaOrig="225">
+          <v:shape id="_x0000_i1055" type="#_x0000_t75" style="width:18pt;height:15.6pt" o:ole="">
+            <v:imagedata r:id="rId5" o:title=""/>
+          </v:shape>
+          <w:control r:id="rId11" w:name="DefaultOcxName5" w:shapeid="_x0000_i1055"/>
+        </w:object>
+      </w:r>
+      <w:proofErr w:type="spellStart"/>
+      <w:r>
+        <w:rPr>
+          <w:rFonts w:ascii="Times New Roman" w:eastAsia="Times New Roman" w:hAnsi="Times New Roman" w:cs="Times New Roman"/>
+          <w:sz w:val="24"/>
+          <w:szCs w:val="24"/>
+        </w:rPr>
+        <w:t>Enums</w:t>
+      </w:r>
+      <w:proofErr w:type="spellEnd"/>
+      <w:r>
+        <w:rPr>
+          <w:rFonts w:ascii="Times New Roman" w:eastAsia="Times New Roman" w:hAnsi="Times New Roman" w:cs="Times New Roman"/>
+          <w:sz w:val="24"/>
+          <w:szCs w:val="24"/>
+        </w:rPr>
+        <w:t xml:space="preserve"> </w:t>
+      </w:r>
+    </w:p>
+    <w:p>
+      <w:pPr>
+        <w:numPr>
+          <w:ilvl w:val="0"/>
+          <w:numId w:val="5"/>
+        </w:numPr>
+        <w:spacing w:before="100" w:beforeAutospacing="1" w:after="100" w:afterAutospacing="1" w:line="240" w:lineRule="auto"/>
+        <w:rPr>
+          <w:rFonts w:ascii="Times New Roman" w:eastAsia="Times New Roman" w:hAnsi="Times New Roman" w:cs="Times New Roman"/>
+          <w:sz w:val="24"/>
+          <w:szCs w:val="24"/>
+        </w:rPr>
+      </w:pPr>
+      <w:r>
+        <w:rPr>
+          <w:rFonts w:ascii="Times New Roman" w:eastAsia="Times New Roman" w:hAnsi="Times New Roman" w:cs="Times New Roman"/>
+          <w:sz w:val="24"/>
+          <w:szCs w:val="24"/>
+        </w:rPr>
+        <w:object w:dxaOrig="225" w:dyaOrig="225">
+          <v:shape id="_x0000_i1054" type="#_x0000_t75" style="width:18pt;height:15.6pt" o:ole="">
+            <v:imagedata r:id="rId5" o:title=""/>
+          </v:shape>
+          <w:control r:id="rId12" w:name="DefaultOcxName6" w:shapeid="_x0000_i1054"/>
+        </w:object>
+      </w:r>
+      <w:proofErr w:type="spellStart"/>
+      <w:r>
+        <w:rPr>
+          <w:rFonts w:ascii="Courier New" w:eastAsia="Times New Roman" w:hAnsi="Courier New" w:cs="Courier New"/>
+          <w:sz w:val="20"/>
+          <w:szCs w:val="20"/>
+        </w:rPr>
+        <w:t>IJobRepository</w:t>
+      </w:r>
+      <w:proofErr w:type="spellEnd"/>
+      <w:r>
+        <w:rPr>
+          <w:rFonts w:ascii="Times New Roman" w:eastAsia="Times New Roman" w:hAnsi="Times New Roman" w:cs="Times New Roman"/>
+          <w:sz w:val="24"/>
+          <w:szCs w:val="24"/>
+        </w:rPr>
+        <w:t xml:space="preserve"> </w:t>
+      </w:r>
+    </w:p>
+    <w:p>
+      <w:pPr>
+        <w:numPr>
+          <w:ilvl w:val="0"/>
+          <w:numId w:val="5"/>
+        </w:numPr>
+        <w:spacing w:before="100" w:beforeAutospacing="1" w:after="100" w:afterAutospacing="1" w:line="240" w:lineRule="auto"/>
+        <w:rPr>
+          <w:rFonts w:ascii="Times New Roman" w:eastAsia="Times New Roman" w:hAnsi="Times New Roman" w:cs="Times New Roman"/>
+          <w:sz w:val="24"/>
+          <w:szCs w:val="24"/>
+        </w:rPr>
+      </w:pPr>
+      <w:r>
+        <w:rPr>
+          <w:rFonts w:ascii="Times New Roman" w:eastAsia="Times New Roman" w:hAnsi="Times New Roman" w:cs="Times New Roman"/>
+          <w:sz w:val="24"/>
+          <w:szCs w:val="24"/>
+        </w:rPr>
+        <w:object w:dxaOrig="225" w:dyaOrig="225">
+          <v:shape id="_x0000_i1053" type="#_x0000_t75" style="width:18pt;height:15.6pt" o:ole="">
+            <v:imagedata r:id="rId5" o:title=""/>
+          </v:shape>
+          <w:control r:id="rId13" w:name="DefaultOcxName7" w:shapeid="_x0000_i1053"/>
+        </w:object>
+      </w:r>
+      <w:proofErr w:type="spellStart"/>
+      <w:r>
+        <w:rPr>
+          <w:rFonts w:ascii="Courier New" w:eastAsia="Times New Roman" w:hAnsi="Courier New" w:cs="Courier New"/>
+          <w:sz w:val="20"/>
+          <w:szCs w:val="20"/>
+        </w:rPr>
+        <w:t>ApplicationDbContext</w:t>
+      </w:r>
+      <w:proofErr w:type="spellEnd"/>
+      <w:r>
+        <w:rPr>
+          <w:rFonts w:ascii="Times New Roman" w:eastAsia="Times New Roman" w:hAnsi="Times New Roman" w:cs="Times New Roman"/>
+          <w:sz w:val="24"/>
+          <w:szCs w:val="24"/>
+        </w:rPr>
+        <w:t xml:space="preserve"> </w:t>
+      </w:r>
+    </w:p>
+    <w:p>
+      <w:pPr>
+        <w:numPr>
+          <w:ilvl w:val="0"/>
+          <w:numId w:val="5"/>
+        </w:numPr>
+        <w:spacing w:before="100" w:beforeAutospacing="1" w:after="100" w:afterAutospacing="1" w:line="240" w:lineRule="auto"/>
+        <w:rPr>
+          <w:rFonts w:ascii="Times New Roman" w:eastAsia="Times New Roman" w:hAnsi="Times New Roman" w:cs="Times New Roman"/>
+          <w:sz w:val="24"/>
+          <w:szCs w:val="24"/>
+        </w:rPr>
+      </w:pPr>
+      <w:r>
+        <w:rPr>
+          <w:rFonts w:ascii="Times New Roman" w:eastAsia="Times New Roman" w:hAnsi="Times New Roman" w:cs="Times New Roman"/>
+          <w:sz w:val="24"/>
+          <w:szCs w:val="24"/>
+        </w:rPr>
+        <w:object w:dxaOrig="225" w:dyaOrig="225">
+          <v:shape id="_x0000_i1052" type="#_x0000_t75" style="width:18pt;height:15.6pt" o:ole="">
+            <v:imagedata r:id="rId5" o:title=""/>
+          </v:shape>
+          <w:control r:id="rId14" w:name="DefaultOcxName8" w:shapeid="_x0000_i1052"/>
+        </w:object>
+      </w:r>
+      <w:r>
+        <w:rPr>
+          <w:rFonts w:ascii="Times New Roman" w:eastAsia="Times New Roman" w:hAnsi="Times New Roman" w:cs="Times New Roman"/>
+          <w:sz w:val="24"/>
+          <w:szCs w:val="24"/>
+        </w:rPr>
+        <w:t xml:space="preserve">Local SQL Server database </w:t>
+      </w:r>
+    </w:p>
+    <w:p>
+      <w:pPr>
+        <w:numPr>
+          <w:ilvl w:val="0"/>
+          <w:numId w:val="5"/>
+        </w:numPr>
+        <w:spacing w:before="100" w:beforeAutospacing="1" w:after="100" w:afterAutospacing="1" w:line="240" w:lineRule="auto"/>
+        <w:rPr>
+          <w:rFonts w:ascii="Times New Roman" w:eastAsia="Times New Roman" w:hAnsi="Times New Roman" w:cs="Times New Roman"/>
+          <w:sz w:val="24"/>
+          <w:szCs w:val="24"/>
+        </w:rPr>
+      </w:pPr>
+      <w:r>
+        <w:rPr>
+          <w:rFonts w:ascii="Times New Roman" w:eastAsia="Times New Roman" w:hAnsi="Times New Roman" w:cs="Times New Roman"/>
+          <w:sz w:val="24"/>
+          <w:szCs w:val="24"/>
+        </w:rPr>
+        <w:object w:dxaOrig="225" w:dyaOrig="225">
+          <v:shape id="_x0000_i1051" type="#_x0000_t75" style="width:18pt;height:15.6pt" o:ole="">
+            <v:imagedata r:id="rId5" o:title=""/>
+          </v:shape>
+          <w:control r:id="rId15" w:name="DefaultOcxName9" w:shapeid="_x0000_i1051"/>
+        </w:object>
+      </w:r>
+      <w:r>
+        <w:rPr>
+          <w:rFonts w:ascii="Times New Roman" w:eastAsia="Times New Roman" w:hAnsi="Times New Roman" w:cs="Times New Roman"/>
+          <w:sz w:val="24"/>
+          <w:szCs w:val="24"/>
+        </w:rPr>
+        <w:t xml:space="preserve">Connection string </w:t>
+      </w:r>
+    </w:p>
+    <w:p>
+      <w:pPr>
+        <w:numPr>
+          <w:ilvl w:val="0"/>
+          <w:numId w:val="5"/>
+        </w:numPr>
+        <w:spacing w:before="100" w:beforeAutospacing="1" w:after="100" w:afterAutospacing="1" w:line="240" w:lineRule="auto"/>
+        <w:rPr>
+          <w:rFonts w:ascii="Times New Roman" w:eastAsia="Times New Roman" w:hAnsi="Times New Roman" w:cs="Times New Roman"/>
+          <w:sz w:val="24"/>
+          <w:szCs w:val="24"/>
+        </w:rPr>
+      </w:pPr>
+      <w:r>
+        <w:rPr>
+          <w:rFonts w:ascii="Times New Roman" w:eastAsia="Times New Roman" w:hAnsi="Times New Roman" w:cs="Times New Roman"/>
+          <w:sz w:val="24"/>
+          <w:szCs w:val="24"/>
+        </w:rPr>
+        <w:object w:dxaOrig="225" w:dyaOrig="225">
+          <v:shape id="_x0000_i1050" type="#_x0000_t75" style="width:18pt;height:15.6pt" o:ole="">
+            <v:imagedata r:id="rId5" o:title=""/>
+          </v:shape>
+          <w:control r:id="rId16" w:name="DefaultOcxName10" w:shapeid="_x0000_i1050"/>
+        </w:object>
+      </w:r>
+      <w:r>
+        <w:rPr>
+          <w:rFonts w:ascii="Times New Roman" w:eastAsia="Times New Roman" w:hAnsi="Times New Roman" w:cs="Times New Roman"/>
+          <w:sz w:val="24"/>
+          <w:szCs w:val="24"/>
+        </w:rPr>
+        <w:t xml:space="preserve">EF Core SQL Server configuration started </w:t>
+      </w:r>
+    </w:p>
+    <w:p>
+      <w:pPr>
+        <w:numPr>
+          <w:ilvl w:val="0"/>
+          <w:numId w:val="5"/>
+        </w:numPr>
+        <w:spacing w:before="100" w:beforeAutospacing="1" w:after="100" w:afterAutospacing="1" w:line="240" w:lineRule="auto"/>
+        <w:rPr>
+          <w:rFonts w:ascii="Times New Roman" w:eastAsia="Times New Roman" w:hAnsi="Times New Roman" w:cs="Times New Roman"/>
+          <w:sz w:val="24"/>
+          <w:szCs w:val="24"/>
+        </w:rPr>
+      </w:pPr>
+      <w:r>
+        <w:rPr>
+          <w:rFonts w:ascii="Times New Roman" w:eastAsia="Times New Roman" w:hAnsi="Times New Roman" w:cs="Times New Roman"/>
+          <w:sz w:val="24"/>
+          <w:szCs w:val="24"/>
+        </w:rPr>
+        <w:object w:dxaOrig="225" w:dyaOrig="225">
+          <v:shape id="_x0000_i1049" type="#_x0000_t75" style="width:18pt;height:15.6pt" o:ole="">
+            <v:imagedata r:id="rId5" o:title=""/>
+          </v:shape>
+          <w:control r:id="rId17" w:name="DefaultOcxName11" w:shapeid="_x0000_i1049"/>
+        </w:object>
+      </w:r>
+      <w:r>
+        <w:rPr>
+          <w:rFonts w:ascii="Times New Roman" w:eastAsia="Times New Roman" w:hAnsi="Times New Roman" w:cs="Times New Roman"/>
+          <w:sz w:val="24"/>
+          <w:szCs w:val="24"/>
+        </w:rPr>
+        <w:t xml:space="preserve">Repository DI registration </w:t>
+      </w:r>
+    </w:p>
+    <w:p>
+      <w:pPr>
+        <w:spacing w:before="100" w:beforeAutospacing="1" w:after="100" w:afterAutospacing="1" w:line="240" w:lineRule="auto"/>
+        <w:outlineLvl w:val="2"/>
+        <w:rPr>
+          <w:rFonts w:ascii="Times New Roman" w:eastAsia="Times New Roman" w:hAnsi="Times New Roman" w:cs="Times New Roman"/>
+          <w:b/>
+          <w:bCs/>
+          <w:sz w:val="27"/>
+          <w:szCs w:val="27"/>
+        </w:rPr>
+      </w:pPr>
+      <w:r>
+        <w:rPr>
+          <w:rFonts w:ascii="Segoe UI Emoji" w:eastAsia="Times New Roman" w:hAnsi="Segoe UI Emoji" w:cs="Segoe UI Emoji"/>
+          <w:b/>
+          <w:bCs/>
+          <w:sz w:val="27"/>
+          <w:szCs w:val="27"/>
+        </w:rPr>
+        <w:lastRenderedPageBreak/>
+        <w:t>🔜</w:t>
+      </w:r>
+      <w:r>
+        <w:rPr>
+          <w:rFonts w:ascii="Times New Roman" w:eastAsia="Times New Roman" w:hAnsi="Times New Roman" w:cs="Times New Roman"/>
+          <w:b/>
+          <w:bCs/>
+          <w:sz w:val="27"/>
+          <w:szCs w:val="27"/>
+        </w:rPr>
+        <w:t xml:space="preserve"> Next</w:t>
+      </w:r>
+    </w:p>
+    <w:p>
+      <w:pPr>
+        <w:spacing w:before="100" w:beforeAutospacing="1" w:after="100" w:afterAutospacing="1" w:line="240" w:lineRule="auto"/>
+        <w:rPr>
+          <w:rFonts w:ascii="Times New Roman" w:eastAsia="Times New Roman" w:hAnsi="Times New Roman" w:cs="Times New Roman"/>
+          <w:sz w:val="24"/>
+          <w:szCs w:val="24"/>
+        </w:rPr>
+      </w:pPr>
+      <w:r>
+        <w:rPr>
+          <w:rFonts w:ascii="Times New Roman" w:eastAsia="Times New Roman" w:hAnsi="Times New Roman" w:cs="Times New Roman"/>
+          <w:b/>
+          <w:bCs/>
+          <w:sz w:val="24"/>
+          <w:szCs w:val="24"/>
+        </w:rPr>
+        <w:t xml:space="preserve">1. Finish </w:t>
+      </w:r>
+      <w:proofErr w:type="spellStart"/>
+      <w:r>
+        <w:rPr>
+          <w:rFonts w:ascii="Courier New" w:eastAsia="Times New Roman" w:hAnsi="Courier New" w:cs="Courier New"/>
+          <w:b/>
+          <w:bCs/>
+          <w:sz w:val="20"/>
+          <w:szCs w:val="20"/>
+        </w:rPr>
+        <w:t>ApplicationDbContext</w:t>
+      </w:r>
+      <w:proofErr w:type="spellEnd"/>
+      <w:r>
+        <w:rPr>
+          <w:rFonts w:ascii="Times New Roman" w:eastAsia="Times New Roman" w:hAnsi="Times New Roman" w:cs="Times New Roman"/>
+          <w:b/>
+          <w:bCs/>
+          <w:sz w:val="24"/>
+          <w:szCs w:val="24"/>
+        </w:rPr>
+        <w:t xml:space="preserve"> configuration</w:t>
+      </w:r>
+    </w:p>
+    <w:p>
+      <w:pPr>
+        <w:spacing w:before="100" w:beforeAutospacing="1" w:after="100" w:afterAutospacing="1" w:line="240" w:lineRule="auto"/>
+        <w:rPr>
+          <w:rFonts w:ascii="Times New Roman" w:eastAsia="Times New Roman" w:hAnsi="Times New Roman" w:cs="Times New Roman"/>
+          <w:sz w:val="24"/>
+          <w:szCs w:val="24"/>
+        </w:rPr>
+      </w:pPr>
+      <w:r>
+        <w:rPr>
+          <w:rFonts w:ascii="Times New Roman" w:eastAsia="Times New Roman" w:hAnsi="Times New Roman" w:cs="Times New Roman"/>
+          <w:sz w:val="24"/>
+          <w:szCs w:val="24"/>
+        </w:rPr>
+        <w:t xml:space="preserve">Understand what EF Core needs to actually connect to </w:t>
+      </w:r>
+      <w:proofErr w:type="spellStart"/>
+      <w:r>
+        <w:rPr>
+          <w:rFonts w:ascii="Courier New" w:eastAsia="Times New Roman" w:hAnsi="Courier New" w:cs="Courier New"/>
+          <w:sz w:val="20"/>
+          <w:szCs w:val="20"/>
+        </w:rPr>
+        <w:t>JobBoardDB</w:t>
+      </w:r>
+      <w:proofErr w:type="spellEnd"/>
+      <w:r>
+        <w:rPr>
+          <w:rFonts w:ascii="Times New Roman" w:eastAsia="Times New Roman" w:hAnsi="Times New Roman" w:cs="Times New Roman"/>
+          <w:sz w:val="24"/>
+          <w:szCs w:val="24"/>
+        </w:rPr>
+        <w:t>.</w:t>
+      </w:r>
+    </w:p>
+    <w:p>
+      <w:pPr>
+        <w:spacing w:before="100" w:beforeAutospacing="1" w:after="100" w:afterAutospacing="1" w:line="240" w:lineRule="auto"/>
+        <w:rPr>
+          <w:rFonts w:ascii="Times New Roman" w:eastAsia="Times New Roman" w:hAnsi="Times New Roman" w:cs="Times New Roman"/>
+          <w:sz w:val="24"/>
+          <w:szCs w:val="24"/>
+        </w:rPr>
+      </w:pPr>
+      <w:r>
+        <w:rPr>
+          <w:rFonts w:ascii="Times New Roman" w:eastAsia="Times New Roman" w:hAnsi="Times New Roman" w:cs="Times New Roman"/>
+          <w:b/>
+          <w:bCs/>
+          <w:sz w:val="24"/>
+          <w:szCs w:val="24"/>
+        </w:rPr>
+        <w:t xml:space="preserve">2. Implement </w:t>
+      </w:r>
+      <w:proofErr w:type="spellStart"/>
+      <w:r>
+        <w:rPr>
+          <w:rFonts w:ascii="Courier New" w:eastAsia="Times New Roman" w:hAnsi="Courier New" w:cs="Courier New"/>
+          <w:b/>
+          <w:bCs/>
+          <w:sz w:val="20"/>
+          <w:szCs w:val="20"/>
+        </w:rPr>
+        <w:t>JobRepository.AddJob</w:t>
+      </w:r>
+      <w:proofErr w:type="spellEnd"/>
+      <w:r>
+        <w:rPr>
+          <w:rFonts w:ascii="Courier New" w:eastAsia="Times New Roman" w:hAnsi="Courier New" w:cs="Courier New"/>
+          <w:b/>
+          <w:bCs/>
+          <w:sz w:val="20"/>
+          <w:szCs w:val="20"/>
+        </w:rPr>
+        <w:t>()</w:t>
+      </w:r>
+      <w:r>
+        <w:rPr>
+          <w:rFonts w:ascii="Times New Roman" w:eastAsia="Times New Roman" w:hAnsi="Times New Roman" w:cs="Times New Roman"/>
+          <w:b/>
+          <w:bCs/>
+          <w:sz w:val="24"/>
+          <w:szCs w:val="24"/>
+        </w:rPr>
+        <w:t xml:space="preserve"> yourself</w:t>
+      </w:r>
+    </w:p>
+    <w:p>
+      <w:pPr>
+        <w:spacing w:before="100" w:beforeAutospacing="1" w:after="100" w:afterAutospacing="1" w:line="240" w:lineRule="auto"/>
+        <w:rPr>
+          <w:rFonts w:ascii="Times New Roman" w:eastAsia="Times New Roman" w:hAnsi="Times New Roman" w:cs="Times New Roman"/>
+          <w:sz w:val="24"/>
+          <w:szCs w:val="24"/>
+        </w:rPr>
+      </w:pPr>
+      <w:r>
+        <w:rPr>
+          <w:rFonts w:ascii="Times New Roman" w:eastAsia="Times New Roman" w:hAnsi="Times New Roman" w:cs="Times New Roman"/>
+          <w:sz w:val="24"/>
+          <w:szCs w:val="24"/>
+        </w:rPr>
+        <w:t>You'll work out:</w:t>
+      </w:r>
+    </w:p>
+    <w:p>
+      <w:pPr>
+        <w:spacing w:beforeAutospacing="1" w:after="100" w:afterAutospacing="1" w:line="240" w:lineRule="auto"/>
+        <w:rPr>
+          <w:rFonts w:ascii="Times New Roman" w:eastAsia="Times New Roman" w:hAnsi="Times New Roman" w:cs="Times New Roman"/>
+          <w:sz w:val="24"/>
+          <w:szCs w:val="24"/>
+        </w:rPr>
+      </w:pPr>
+      <w:r>
+        <w:rPr>
+          <w:rFonts w:ascii="Courier New" w:eastAsia="Times New Roman" w:hAnsi="Courier New" w:cs="Courier New"/>
+          <w:sz w:val="20"/>
+          <w:szCs w:val="20"/>
+        </w:rPr>
+        <w:t>Job</w:t>
+      </w:r>
+      <w:r>
+        <w:rPr>
+          <w:rFonts w:ascii="Times New Roman" w:eastAsia="Times New Roman" w:hAnsi="Times New Roman" w:cs="Times New Roman"/>
+          <w:sz w:val="24"/>
+          <w:szCs w:val="24"/>
+        </w:rPr>
+        <w:t xml:space="preserve"> → </w:t>
+      </w:r>
+      <w:proofErr w:type="spellStart"/>
+      <w:r>
+        <w:rPr>
+          <w:rFonts w:ascii="Courier New" w:eastAsia="Times New Roman" w:hAnsi="Courier New" w:cs="Courier New"/>
+          <w:sz w:val="20"/>
+          <w:szCs w:val="20"/>
+        </w:rPr>
+        <w:t>DbSet</w:t>
+      </w:r>
+      <w:proofErr w:type="spellEnd"/>
+      <w:r>
+        <w:rPr>
+          <w:rFonts w:ascii="Times New Roman" w:eastAsia="Times New Roman" w:hAnsi="Times New Roman" w:cs="Times New Roman"/>
+          <w:sz w:val="24"/>
+          <w:szCs w:val="24"/>
+        </w:rPr>
+        <w:t xml:space="preserve"> → tracking → </w:t>
+      </w:r>
+      <w:proofErr w:type="spellStart"/>
+      <w:r>
+        <w:rPr>
+          <w:rFonts w:ascii="Courier New" w:eastAsia="Times New Roman" w:hAnsi="Courier New" w:cs="Courier New"/>
+          <w:sz w:val="20"/>
+          <w:szCs w:val="20"/>
+        </w:rPr>
+        <w:t>SaveChanges</w:t>
+      </w:r>
+      <w:proofErr w:type="spellEnd"/>
+    </w:p>
+    <w:p>
+      <w:pPr>
+        <w:spacing w:before="100" w:beforeAutospacing="1" w:after="100" w:afterAutospacing="1" w:line="240" w:lineRule="auto"/>
+        <w:rPr>
+          <w:rFonts w:ascii="Times New Roman" w:eastAsia="Times New Roman" w:hAnsi="Times New Roman" w:cs="Times New Roman"/>
+          <w:sz w:val="24"/>
+          <w:szCs w:val="24"/>
+        </w:rPr>
+      </w:pPr>
+      <w:r>
+        <w:rPr>
+          <w:rFonts w:ascii="Times New Roman" w:eastAsia="Times New Roman" w:hAnsi="Times New Roman" w:cs="Times New Roman"/>
+          <w:b/>
+          <w:bCs/>
+          <w:sz w:val="24"/>
+          <w:szCs w:val="24"/>
+        </w:rPr>
+        <w:t>3. Register/test the database setup</w:t>
+      </w:r>
+    </w:p>
+    <w:p>
+      <w:pPr>
+        <w:spacing w:before="100" w:beforeAutospacing="1" w:after="100" w:afterAutospacing="1" w:line="240" w:lineRule="auto"/>
+        <w:rPr>
+          <w:rFonts w:ascii="Times New Roman" w:eastAsia="Times New Roman" w:hAnsi="Times New Roman" w:cs="Times New Roman"/>
+          <w:sz w:val="24"/>
+          <w:szCs w:val="24"/>
+        </w:rPr>
+      </w:pPr>
+      <w:r>
+        <w:rPr>
+          <w:rFonts w:ascii="Times New Roman" w:eastAsia="Times New Roman" w:hAnsi="Times New Roman" w:cs="Times New Roman"/>
+          <w:sz w:val="24"/>
+          <w:szCs w:val="24"/>
+        </w:rPr>
+        <w:t xml:space="preserve">Make sure EF Core can actually communicate with your </w:t>
+      </w:r>
+      <w:proofErr w:type="spellStart"/>
+      <w:r>
+        <w:rPr>
+          <w:rFonts w:ascii="Times New Roman" w:eastAsia="Times New Roman" w:hAnsi="Times New Roman" w:cs="Times New Roman"/>
+          <w:sz w:val="24"/>
+          <w:szCs w:val="24"/>
+        </w:rPr>
+        <w:t>LocalDB</w:t>
+      </w:r>
+      <w:proofErr w:type="spellEnd"/>
+      <w:r>
+        <w:rPr>
+          <w:rFonts w:ascii="Times New Roman" w:eastAsia="Times New Roman" w:hAnsi="Times New Roman" w:cs="Times New Roman"/>
+          <w:sz w:val="24"/>
+          <w:szCs w:val="24"/>
+        </w:rPr>
+        <w:t>.</w:t>
+      </w:r>
+    </w:p>
+    <w:p>
+      <w:pPr>
+        <w:spacing w:before="100" w:beforeAutospacing="1" w:after="100" w:afterAutospacing="1" w:line="240" w:lineRule="auto"/>
+        <w:rPr>
+          <w:rFonts w:ascii="Times New Roman" w:eastAsia="Times New Roman" w:hAnsi="Times New Roman" w:cs="Times New Roman"/>
+          <w:sz w:val="24"/>
+          <w:szCs w:val="24"/>
+        </w:rPr>
+      </w:pPr>
+      <w:r>
+        <w:rPr>
+          <w:rFonts w:ascii="Times New Roman" w:eastAsia="Times New Roman" w:hAnsi="Times New Roman" w:cs="Times New Roman"/>
+          <w:b/>
+          <w:bCs/>
+          <w:sz w:val="24"/>
+          <w:szCs w:val="24"/>
+        </w:rPr>
+        <w:t>4. Create your first migration</w:t>
+      </w:r>
+    </w:p>
+    <w:p>
+      <w:pPr>
+        <w:spacing w:before="100" w:beforeAutospacing="1" w:after="100" w:afterAutospacing="1" w:line="240" w:lineRule="auto"/>
+        <w:rPr>
+          <w:rFonts w:ascii="Times New Roman" w:eastAsia="Times New Roman" w:hAnsi="Times New Roman" w:cs="Times New Roman"/>
+          <w:sz w:val="24"/>
+          <w:szCs w:val="24"/>
+        </w:rPr>
+      </w:pPr>
+      <w:r>
+        <w:rPr>
+          <w:rFonts w:ascii="Times New Roman" w:eastAsia="Times New Roman" w:hAnsi="Times New Roman" w:cs="Times New Roman"/>
+          <w:sz w:val="24"/>
+          <w:szCs w:val="24"/>
+        </w:rPr>
+        <w:t>This is where you'll really see how your domain model becomes database schema.</w:t>
+      </w:r>
+    </w:p>
+    <w:p>
+      <w:pPr>
+        <w:spacing w:before="100" w:beforeAutospacing="1" w:after="100" w:afterAutospacing="1" w:line="240" w:lineRule="auto"/>
+        <w:rPr>
+          <w:rFonts w:ascii="Times New Roman" w:eastAsia="Times New Roman" w:hAnsi="Times New Roman" w:cs="Times New Roman"/>
+          <w:sz w:val="24"/>
+          <w:szCs w:val="24"/>
+        </w:rPr>
+      </w:pPr>
+      <w:r>
+        <w:rPr>
+          <w:rFonts w:ascii="Times New Roman" w:eastAsia="Times New Roman" w:hAnsi="Times New Roman" w:cs="Times New Roman"/>
+          <w:b/>
+          <w:bCs/>
+          <w:sz w:val="24"/>
+          <w:szCs w:val="24"/>
+        </w:rPr>
+        <w:t xml:space="preserve">5. Create </w:t>
+      </w:r>
+      <w:proofErr w:type="spellStart"/>
+      <w:r>
+        <w:rPr>
+          <w:rFonts w:ascii="Courier New" w:eastAsia="Times New Roman" w:hAnsi="Courier New" w:cs="Courier New"/>
+          <w:b/>
+          <w:bCs/>
+          <w:sz w:val="20"/>
+          <w:szCs w:val="20"/>
+        </w:rPr>
+        <w:t>JobApplication</w:t>
+      </w:r>
+      <w:proofErr w:type="spellEnd"/>
+    </w:p>
+    <w:p>
+      <w:pPr>
+        <w:spacing w:before="100" w:beforeAutospacing="1" w:after="100" w:afterAutospacing="1" w:line="240" w:lineRule="auto"/>
+        <w:rPr>
+          <w:rFonts w:ascii="Times New Roman" w:eastAsia="Times New Roman" w:hAnsi="Times New Roman" w:cs="Times New Roman"/>
+          <w:sz w:val="24"/>
+          <w:szCs w:val="24"/>
+        </w:rPr>
+      </w:pPr>
+      <w:r>
+        <w:rPr>
+          <w:rFonts w:ascii="Times New Roman" w:eastAsia="Times New Roman" w:hAnsi="Times New Roman" w:cs="Times New Roman"/>
+          <w:sz w:val="24"/>
+          <w:szCs w:val="24"/>
+        </w:rPr>
+        <w:t xml:space="preserve">But only after you've understood what happened with </w:t>
+      </w:r>
+      <w:r>
+        <w:rPr>
+          <w:rFonts w:ascii="Courier New" w:eastAsia="Times New Roman" w:hAnsi="Courier New" w:cs="Courier New"/>
+          <w:sz w:val="20"/>
+          <w:szCs w:val="20"/>
+        </w:rPr>
+        <w:t>Job</w:t>
+      </w:r>
+      <w:r>
+        <w:rPr>
+          <w:rFonts w:ascii="Times New Roman" w:eastAsia="Times New Roman" w:hAnsi="Times New Roman" w:cs="Times New Roman"/>
+          <w:sz w:val="24"/>
+          <w:szCs w:val="24"/>
+        </w:rPr>
+        <w:t>.</w:t>
+      </w:r>
+    </w:p>
+    <w:p>
+      <w:pPr>
+        <w:spacing w:before="100" w:beforeAutospacing="1" w:after="100" w:afterAutospacing="1" w:line="240" w:lineRule="auto"/>
+        <w:rPr>
+          <w:rFonts w:ascii="Times New Roman" w:eastAsia="Times New Roman" w:hAnsi="Times New Roman" w:cs="Times New Roman"/>
+          <w:sz w:val="24"/>
+          <w:szCs w:val="24"/>
+        </w:rPr>
+      </w:pPr>
+      <w:r>
+        <w:rPr>
+          <w:rFonts w:ascii="Times New Roman" w:eastAsia="Times New Roman" w:hAnsi="Times New Roman" w:cs="Times New Roman"/>
+          <w:b/>
+          <w:bCs/>
+          <w:sz w:val="24"/>
+          <w:szCs w:val="24"/>
+        </w:rPr>
+        <w:t xml:space="preserve">6. Identity / </w:t>
+      </w:r>
+      <w:proofErr w:type="spellStart"/>
+      <w:r>
+        <w:rPr>
+          <w:rFonts w:ascii="Times New Roman" w:eastAsia="Times New Roman" w:hAnsi="Times New Roman" w:cs="Times New Roman"/>
+          <w:b/>
+          <w:bCs/>
+          <w:sz w:val="24"/>
+          <w:szCs w:val="24"/>
+        </w:rPr>
+        <w:t>ApplicationUser</w:t>
+      </w:r>
+      <w:proofErr w:type="spellEnd"/>
+      <w:r>
+        <w:rPr>
+          <w:rFonts w:ascii="Times New Roman" w:eastAsia="Times New Roman" w:hAnsi="Times New Roman" w:cs="Times New Roman"/>
+          <w:b/>
+          <w:bCs/>
+          <w:sz w:val="24"/>
+          <w:szCs w:val="24"/>
+        </w:rPr>
+        <w:t xml:space="preserve"> + roles</w:t>
+      </w:r>
+    </w:p>
+    <w:p>
+      <w:pPr>
+        <w:spacing w:before="100" w:beforeAutospacing="1" w:after="100" w:afterAutospacing="1" w:line="240" w:lineRule="auto"/>
+        <w:rPr>
+          <w:rFonts w:ascii="Times New Roman" w:eastAsia="Times New Roman" w:hAnsi="Times New Roman" w:cs="Times New Roman"/>
+          <w:sz w:val="24"/>
+          <w:szCs w:val="24"/>
+        </w:rPr>
+      </w:pPr>
+      <w:r>
+        <w:rPr>
+          <w:rFonts w:ascii="Times New Roman" w:eastAsia="Times New Roman" w:hAnsi="Times New Roman" w:cs="Times New Roman"/>
+          <w:sz w:val="24"/>
+          <w:szCs w:val="24"/>
+        </w:rPr>
+        <w:t xml:space="preserve">Employer / </w:t>
+      </w:r>
+      <w:proofErr w:type="spellStart"/>
+      <w:r>
+        <w:rPr>
+          <w:rFonts w:ascii="Times New Roman" w:eastAsia="Times New Roman" w:hAnsi="Times New Roman" w:cs="Times New Roman"/>
+          <w:sz w:val="24"/>
+          <w:szCs w:val="24"/>
+        </w:rPr>
+        <w:t>JobSeeker</w:t>
+      </w:r>
+      <w:proofErr w:type="spellEnd"/>
+      <w:r>
+        <w:rPr>
+          <w:rFonts w:ascii="Times New Roman" w:eastAsia="Times New Roman" w:hAnsi="Times New Roman" w:cs="Times New Roman"/>
+          <w:sz w:val="24"/>
+          <w:szCs w:val="24"/>
+        </w:rPr>
+        <w:t>.</w:t>
+      </w:r>
+    </w:p>
+    <w:p>
+      <w:pPr>
+        <w:spacing w:before="100" w:beforeAutospacing="1" w:after="100" w:afterAutospacing="1" w:line="240" w:lineRule="auto"/>
+        <w:rPr>
+          <w:rFonts w:ascii="Times New Roman" w:eastAsia="Times New Roman" w:hAnsi="Times New Roman" w:cs="Times New Roman"/>
+          <w:sz w:val="24"/>
+          <w:szCs w:val="24"/>
+        </w:rPr>
+      </w:pPr>
+      <w:r>
+        <w:rPr>
+          <w:rFonts w:ascii="Times New Roman" w:eastAsia="Times New Roman" w:hAnsi="Times New Roman" w:cs="Times New Roman"/>
+          <w:b/>
+          <w:bCs/>
+          <w:sz w:val="24"/>
+          <w:szCs w:val="24"/>
+        </w:rPr>
+        <w:t>7. DTOs</w:t>
+      </w:r>
+    </w:p>
+    <w:p>
+      <w:pPr>
+        <w:spacing w:before="100" w:beforeAutospacing="1" w:after="100" w:afterAutospacing="1" w:line="240" w:lineRule="auto"/>
+        <w:rPr>
+          <w:rFonts w:ascii="Times New Roman" w:eastAsia="Times New Roman" w:hAnsi="Times New Roman" w:cs="Times New Roman"/>
+          <w:sz w:val="24"/>
+          <w:szCs w:val="24"/>
+        </w:rPr>
+      </w:pPr>
+      <w:r>
+        <w:rPr>
+          <w:rFonts w:ascii="Times New Roman" w:eastAsia="Times New Roman" w:hAnsi="Times New Roman" w:cs="Times New Roman"/>
+          <w:sz w:val="24"/>
+          <w:szCs w:val="24"/>
+        </w:rPr>
+        <w:t>Separate API request/response shapes from your domain entity.</w:t>
+      </w:r>
+    </w:p>
+    <w:p>
+      <w:pPr>
+        <w:spacing w:before="100" w:beforeAutospacing="1" w:after="100" w:afterAutospacing="1" w:line="240" w:lineRule="auto"/>
+        <w:rPr>
+          <w:rFonts w:ascii="Times New Roman" w:eastAsia="Times New Roman" w:hAnsi="Times New Roman" w:cs="Times New Roman"/>
+          <w:sz w:val="24"/>
+          <w:szCs w:val="24"/>
+        </w:rPr>
+      </w:pPr>
+      <w:r>
+        <w:rPr>
+          <w:rFonts w:ascii="Times New Roman" w:eastAsia="Times New Roman" w:hAnsi="Times New Roman" w:cs="Times New Roman"/>
+          <w:b/>
+          <w:bCs/>
+          <w:sz w:val="24"/>
+          <w:szCs w:val="24"/>
+        </w:rPr>
+        <w:t>8. Application service</w:t>
+      </w:r>
+    </w:p>
+    <w:p>
+      <w:pPr>
+        <w:spacing w:before="100" w:beforeAutospacing="1" w:after="100" w:afterAutospacing="1" w:line="240" w:lineRule="auto"/>
+        <w:rPr>
+          <w:rFonts w:ascii="Times New Roman" w:eastAsia="Times New Roman" w:hAnsi="Times New Roman" w:cs="Times New Roman"/>
+          <w:sz w:val="24"/>
+          <w:szCs w:val="24"/>
+        </w:rPr>
+      </w:pPr>
+      <w:r>
+        <w:rPr>
+          <w:rFonts w:ascii="Times New Roman" w:eastAsia="Times New Roman" w:hAnsi="Times New Roman" w:cs="Times New Roman"/>
+          <w:sz w:val="24"/>
+          <w:szCs w:val="24"/>
+        </w:rPr>
+        <w:t>Business/use-case logic.</w:t>
+      </w:r>
+    </w:p>
+    <w:p>
+      <w:pPr>
+        <w:spacing w:before="100" w:beforeAutospacing="1" w:after="100" w:afterAutospacing="1" w:line="240" w:lineRule="auto"/>
+        <w:rPr>
+          <w:rFonts w:ascii="Times New Roman" w:eastAsia="Times New Roman" w:hAnsi="Times New Roman" w:cs="Times New Roman"/>
+          <w:sz w:val="24"/>
+          <w:szCs w:val="24"/>
+        </w:rPr>
+      </w:pPr>
+      <w:r>
+        <w:rPr>
+          <w:rFonts w:ascii="Times New Roman" w:eastAsia="Times New Roman" w:hAnsi="Times New Roman" w:cs="Times New Roman"/>
+          <w:b/>
+          <w:bCs/>
+          <w:sz w:val="24"/>
+          <w:szCs w:val="24"/>
+        </w:rPr>
+        <w:t>9. First Jobs Controller</w:t>
+      </w:r>
+    </w:p>
+    <w:p>
+      <w:pPr>
+        <w:spacing w:before="100" w:beforeAutospacing="1" w:after="100" w:afterAutospacing="1" w:line="240" w:lineRule="auto"/>
+        <w:rPr>
+          <w:rFonts w:ascii="Times New Roman" w:eastAsia="Times New Roman" w:hAnsi="Times New Roman" w:cs="Times New Roman"/>
+          <w:sz w:val="24"/>
+          <w:szCs w:val="24"/>
+        </w:rPr>
+      </w:pPr>
+      <w:r>
+        <w:rPr>
+          <w:rFonts w:ascii="Times New Roman" w:eastAsia="Times New Roman" w:hAnsi="Times New Roman" w:cs="Times New Roman"/>
+          <w:sz w:val="24"/>
+          <w:szCs w:val="24"/>
+        </w:rPr>
+        <w:t>Then your first real API endpoint.</w:t>
+      </w:r>
+    </w:p>
+    <w:p>
+      <w:pPr>
+        <w:spacing w:before="100" w:beforeAutospacing="1" w:after="100" w:afterAutospacing="1" w:line="240" w:lineRule="auto"/>
+        <w:rPr>
+          <w:rFonts w:ascii="Times New Roman" w:eastAsia="Times New Roman" w:hAnsi="Times New Roman" w:cs="Times New Roman"/>
+          <w:sz w:val="24"/>
+          <w:szCs w:val="24"/>
+        </w:rPr>
+      </w:pPr>
+      <w:r>
+        <w:rPr>
+          <w:rFonts w:ascii="Times New Roman" w:eastAsia="Times New Roman" w:hAnsi="Times New Roman" w:cs="Times New Roman"/>
+          <w:b/>
+          <w:bCs/>
+          <w:sz w:val="24"/>
+          <w:szCs w:val="24"/>
+        </w:rPr>
+        <w:t>10. Swagger</w:t>
+      </w:r>
+    </w:p>
+    <w:p>
+      <w:pPr>
+        <w:spacing w:before="100" w:beforeAutospacing="1" w:after="100" w:afterAutospacing="1" w:line="240" w:lineRule="auto"/>
+        <w:rPr>
+          <w:rFonts w:ascii="Times New Roman" w:eastAsia="Times New Roman" w:hAnsi="Times New Roman" w:cs="Times New Roman"/>
+          <w:sz w:val="24"/>
+          <w:szCs w:val="24"/>
+        </w:rPr>
+      </w:pPr>
+      <w:r>
+        <w:rPr>
+          <w:rFonts w:ascii="Times New Roman" w:eastAsia="Times New Roman" w:hAnsi="Times New Roman" w:cs="Times New Roman"/>
+          <w:sz w:val="24"/>
+          <w:szCs w:val="24"/>
+        </w:rPr>
+        <w:t>And start exercising the API.</w:t>
+      </w:r>
+    </w:p>
+    <w:p>
+      <w:pPr>
+        <w:spacing w:before="100" w:beforeAutospacing="1" w:after="100" w:afterAutospacing="1" w:line="240" w:lineRule="auto"/>
+        <w:rPr>
+          <w:rFonts w:ascii="Times New Roman" w:eastAsia="Times New Roman" w:hAnsi="Times New Roman" w:cs="Times New Roman"/>
+          <w:sz w:val="24"/>
+          <w:szCs w:val="24"/>
+        </w:rPr>
+      </w:pPr>
+      <w:r>
+        <w:rPr>
+          <w:rFonts w:ascii="Times New Roman" w:eastAsia="Times New Roman" w:hAnsi="Times New Roman" w:cs="Times New Roman"/>
+          <w:sz w:val="24"/>
+          <w:szCs w:val="24"/>
+        </w:rPr>
+        <w:t>Eventually:</w:t>
+      </w:r>
+    </w:p>
+    <w:p>
+      <w:pPr>
+        <w:tabs>
+          <w:tab w:val="left" w:pos="916"/>
+          <w:tab w:val="left" w:pos="1832"/>
+          <w:tab w:val="left" w:pos="2748"/>
+          <w:tab w:val="left" w:pos="3664"/>
+          <w:tab w:val="left" w:pos="4580"/>
+          <w:tab w:val="left" w:pos="5496"/>
+          <w:tab w:val="left" w:pos="6412"/>
+          <w:tab w:val="left" w:pos="7328"/>
+          <w:tab w:val="left" w:pos="8244"/>
+          <w:tab w:val="left" w:pos="9160"/>
+          <w:tab w:val="left" w:pos="10076"/>
+          <w:tab w:val="left" w:pos="10992"/>
+          <w:tab w:val="left" w:pos="11908"/>
+          <w:tab w:val="left" w:pos="12824"/>
+          <w:tab w:val="left" w:pos="13740"/>
+          <w:tab w:val="left" w:pos="14656"/>
+        </w:tabs>
+        <w:spacing w:after="0" w:line="240" w:lineRule="auto"/>
+        <w:rPr>
+          <w:rFonts w:ascii="Courier New" w:eastAsia="Times New Roman" w:hAnsi="Courier New" w:cs="Courier New"/>
+          <w:sz w:val="20"/>
+          <w:szCs w:val="20"/>
+        </w:rPr>
+      </w:pPr>
+      <w:r>
+        <w:rPr>
+          <w:rFonts w:ascii="Courier New" w:eastAsia="Times New Roman" w:hAnsi="Courier New" w:cs="Courier New"/>
+          <w:sz w:val="20"/>
+          <w:szCs w:val="20"/>
+        </w:rPr>
+        <w:lastRenderedPageBreak/>
+        <w:t>POST /</w:t>
+      </w:r>
+      <w:proofErr w:type="spellStart"/>
+      <w:r>
+        <w:rPr>
+          <w:rFonts w:ascii="Courier New" w:eastAsia="Times New Roman" w:hAnsi="Courier New" w:cs="Courier New"/>
+          <w:sz w:val="20"/>
+          <w:szCs w:val="20"/>
+        </w:rPr>
+        <w:t>api</w:t>
+      </w:r>
+      <w:proofErr w:type="spellEnd"/>
+      <w:r>
+        <w:rPr>
+          <w:rFonts w:ascii="Courier New" w:eastAsia="Times New Roman" w:hAnsi="Courier New" w:cs="Courier New"/>
+          <w:sz w:val="20"/>
+          <w:szCs w:val="20"/>
+        </w:rPr>
+        <w:t>/jobs</w:t>
+      </w:r>
+    </w:p>
+    <w:p>
+      <w:pPr>
+        <w:tabs>
+          <w:tab w:val="left" w:pos="916"/>
+          <w:tab w:val="left" w:pos="1832"/>
+          <w:tab w:val="left" w:pos="2748"/>
+          <w:tab w:val="left" w:pos="3664"/>
+          <w:tab w:val="left" w:pos="4580"/>
+          <w:tab w:val="left" w:pos="5496"/>
+          <w:tab w:val="left" w:pos="6412"/>
+          <w:tab w:val="left" w:pos="7328"/>
+          <w:tab w:val="left" w:pos="8244"/>
+          <w:tab w:val="left" w:pos="9160"/>
+          <w:tab w:val="left" w:pos="10076"/>
+          <w:tab w:val="left" w:pos="10992"/>
+          <w:tab w:val="left" w:pos="11908"/>
+          <w:tab w:val="left" w:pos="12824"/>
+          <w:tab w:val="left" w:pos="13740"/>
+          <w:tab w:val="left" w:pos="14656"/>
+        </w:tabs>
+        <w:spacing w:after="0" w:line="240" w:lineRule="auto"/>
+        <w:rPr>
+          <w:rFonts w:ascii="Courier New" w:eastAsia="Times New Roman" w:hAnsi="Courier New" w:cs="Courier New"/>
+          <w:sz w:val="20"/>
+          <w:szCs w:val="20"/>
+        </w:rPr>
+      </w:pPr>
+      <w:proofErr w:type="gramStart"/>
+      <w:r>
+        <w:rPr>
+          <w:rFonts w:ascii="Courier New" w:eastAsia="Times New Roman" w:hAnsi="Courier New" w:cs="Courier New"/>
+          <w:sz w:val="20"/>
+          <w:szCs w:val="20"/>
+        </w:rPr>
+        <w:t>GET  /</w:t>
+      </w:r>
+      <w:proofErr w:type="spellStart"/>
+      <w:proofErr w:type="gramEnd"/>
+      <w:r>
+        <w:rPr>
+          <w:rFonts w:ascii="Courier New" w:eastAsia="Times New Roman" w:hAnsi="Courier New" w:cs="Courier New"/>
+          <w:sz w:val="20"/>
+          <w:szCs w:val="20"/>
+        </w:rPr>
+        <w:t>api</w:t>
+      </w:r>
+      <w:proofErr w:type="spellEnd"/>
+      <w:r>
+        <w:rPr>
+          <w:rFonts w:ascii="Courier New" w:eastAsia="Times New Roman" w:hAnsi="Courier New" w:cs="Courier New"/>
+          <w:sz w:val="20"/>
+          <w:szCs w:val="20"/>
+        </w:rPr>
+        <w:t>/jobs</w:t>
+      </w:r>
+    </w:p>
+    <w:p>
+      <w:pPr>
+        <w:tabs>
+          <w:tab w:val="left" w:pos="916"/>
+          <w:tab w:val="left" w:pos="1832"/>
+          <w:tab w:val="left" w:pos="2748"/>
+          <w:tab w:val="left" w:pos="3664"/>
+          <w:tab w:val="left" w:pos="4580"/>
+          <w:tab w:val="left" w:pos="5496"/>
+          <w:tab w:val="left" w:pos="6412"/>
+          <w:tab w:val="left" w:pos="7328"/>
+          <w:tab w:val="left" w:pos="8244"/>
+          <w:tab w:val="left" w:pos="9160"/>
+          <w:tab w:val="left" w:pos="10076"/>
+          <w:tab w:val="left" w:pos="10992"/>
+          <w:tab w:val="left" w:pos="11908"/>
+          <w:tab w:val="left" w:pos="12824"/>
+          <w:tab w:val="left" w:pos="13740"/>
+          <w:tab w:val="left" w:pos="14656"/>
+        </w:tabs>
+        <w:spacing w:after="0" w:line="240" w:lineRule="auto"/>
+        <w:rPr>
+          <w:rFonts w:ascii="Courier New" w:eastAsia="Times New Roman" w:hAnsi="Courier New" w:cs="Courier New"/>
+          <w:sz w:val="20"/>
+          <w:szCs w:val="20"/>
+        </w:rPr>
+      </w:pPr>
+      <w:r>
+        <w:rPr>
+          <w:rFonts w:ascii="Courier New" w:eastAsia="Times New Roman" w:hAnsi="Courier New" w:cs="Courier New"/>
+          <w:sz w:val="20"/>
+          <w:szCs w:val="20"/>
+        </w:rPr>
+        <w:t>...</w:t>
+      </w:r>
+    </w:p>
+    <w:p>
+      <w:pPr>
+        <w:spacing w:before="100" w:beforeAutospacing="1" w:after="100" w:afterAutospacing="1" w:line="240" w:lineRule="auto"/>
+        <w:rPr>
+          <w:rFonts w:ascii="Times New Roman" w:eastAsia="Times New Roman" w:hAnsi="Times New Roman" w:cs="Times New Roman"/>
+          <w:sz w:val="24"/>
+          <w:szCs w:val="24"/>
+        </w:rPr>
+      </w:pPr>
+      <w:r>
+        <w:rPr>
+          <w:rFonts w:ascii="Times New Roman" w:eastAsia="Times New Roman" w:hAnsi="Times New Roman" w:cs="Times New Roman"/>
+          <w:sz w:val="24"/>
+          <w:szCs w:val="24"/>
+        </w:rPr>
+        <w:t xml:space="preserve">But </w:t>
+      </w:r>
+      <w:r>
+        <w:rPr>
+          <w:rFonts w:ascii="Times New Roman" w:eastAsia="Times New Roman" w:hAnsi="Times New Roman" w:cs="Times New Roman"/>
+          <w:b/>
+          <w:bCs/>
+          <w:sz w:val="24"/>
+          <w:szCs w:val="24"/>
+        </w:rPr>
+        <w:t>don't worry about those endpoints tonight</w:t>
+      </w:r>
+      <w:r>
+        <w:rPr>
+          <w:rFonts w:ascii="Times New Roman" w:eastAsia="Times New Roman" w:hAnsi="Times New Roman" w:cs="Times New Roman"/>
+          <w:sz w:val="24"/>
+          <w:szCs w:val="24"/>
+        </w:rPr>
+        <w:t>.</w:t>
       </w:r>
     </w:p>
     <w:p>
@@ -1143,7 +2536,7 @@
 </file>
 
 <file path=word/numbering.xml><?xml version="1.0" encoding="utf-8"?>
-<w:numbering xmlns:wpc="http://schemas.microsoft.com/office/word/2010/wordprocessingCanvas" xmlns:cx="http://schemas.microsoft.com/office/drawing/2014/chartex" xmlns:mc="http://schemas.openxmlformats.org/markup-compatibility/2006" xmlns:o="urn:schemas-microsoft-com:office:office" xmlns:r="http://schemas.openxmlformats.org/officeDocument/2006/relationships" xmlns:m="http://schemas.openxmlformats.org/officeDocument/2006/math" xmlns:v="urn:schemas-microsoft-com:vml" xmlns:wp14="http://schemas.microsoft.com/office/word/2010/wordprocessingDrawing" xmlns:wp="http://schemas.openxmlformats.org/drawingml/2006/wordprocessingDrawing" xmlns:w10="urn:schemas-microsoft-com:office:word" xmlns:w="http://schemas.openxmlformats.org/wordprocessingml/2006/main" xmlns:w14="http://schemas.microsoft.com/office/word/2010/wordml" xmlns:w15="http://schemas.microsoft.com/office/word/2012/wordml" xmlns:w16se="http://schemas.microsoft.com/office/word/2015/wordml/symex" xmlns:wpg="http://schemas.microsoft.com/office/word/2010/wordprocessingGroup" xmlns:wpi="http://schemas.microsoft.com/office/word/2010/wordprocessingInk" xmlns:wne="http://schemas.microsoft.com/office/word/2006/wordml" xmlns:wps="http://schemas.microsoft.com/office/word/2010/wordprocessingShape" mc:Ignorable="w14 w15 w16se wp14">
+<w:numbering xmlns:wpc="http://schemas.microsoft.com/office/word/2010/wordprocessingCanvas" xmlns:cx="http://schemas.microsoft.com/office/drawing/2014/chartex" xmlns:cx1="http://schemas.microsoft.com/office/drawing/2015/9/8/chartex" xmlns:cx2="http://schemas.microsoft.com/office/drawing/2015/10/21/chartex" xmlns:cx3="http://schemas.microsoft.com/office/drawing/2016/5/9/chartex" xmlns:cx4="http://schemas.microsoft.com/office/drawing/2016/5/10/chartex" xmlns:cx5="http://schemas.microsoft.com/office/drawing/2016/5/11/chartex" xmlns:cx6="http://schemas.microsoft.com/office/drawing/2016/5/12/chartex" xmlns:cx7="http://schemas.microsoft.com/office/drawing/2016/5/13/chartex" xmlns:cx8="http://schemas.microsoft.com/office/drawing/2016/5/14/chartex" xmlns:mc="http://schemas.openxmlformats.org/markup-compatibility/2006" xmlns:aink="http://schemas.microsoft.com/office/drawing/2016/ink" xmlns:am3d="http://schemas.microsoft.com/office/drawing/2017/model3d" xmlns:o="urn:schemas-microsoft-com:office:office" xmlns:r="http://schemas.openxmlformats.org/officeDocument/2006/relationships" xmlns:m="http://schemas.openxmlformats.org/officeDocument/2006/math" xmlns:v="urn:schemas-microsoft-com:vml" xmlns:wp14="http://schemas.microsoft.com/office/word/2010/wordprocessingDrawing" xmlns:wp="http://schemas.openxmlformats.org/drawingml/2006/wordprocessingDrawing" xmlns:w10="urn:schemas-microsoft-com:office:word" xmlns:w="http://schemas.openxmlformats.org/wordprocessingml/2006/main" xmlns:w14="http://schemas.microsoft.com/office/word/2010/wordml" xmlns:w15="http://schemas.microsoft.com/office/word/2012/wordml" xmlns:w16cid="http://schemas.microsoft.com/office/word/2016/wordml/cid" xmlns:w16se="http://schemas.microsoft.com/office/word/2015/wordml/symex" xmlns:wpg="http://schemas.microsoft.com/office/word/2010/wordprocessingGroup" xmlns:wpi="http://schemas.microsoft.com/office/word/2010/wordprocessingInk" xmlns:wne="http://schemas.microsoft.com/office/word/2006/wordml" xmlns:wps="http://schemas.microsoft.com/office/word/2010/wordprocessingShape" mc:Ignorable="w14 w15 w16se w16cid wp14">
   <w:abstractNum w:abstractNumId="0" w15:restartNumberingAfterBreak="0">
     <w:nsid w:val="1DEA5EED"/>
     <w:multiLevelType w:val="hybridMultilevel"/>
@@ -1323,6 +2716,155 @@
     </w:lvl>
   </w:abstractNum>
   <w:abstractNum w:abstractNumId="2" w15:restartNumberingAfterBreak="0">
+    <w:nsid w:val="34AD12C9"/>
+    <w:multiLevelType w:val="multilevel"/>
+    <w:tmpl w:val="DF066BFE"/>
+    <w:lvl w:ilvl="0">
+      <w:start w:val="1"/>
+      <w:numFmt w:val="bullet"/>
+      <w:lvlText w:val=""/>
+      <w:lvlJc w:val="left"/>
+      <w:pPr>
+        <w:tabs>
+          <w:tab w:val="num" w:pos="720"/>
+        </w:tabs>
+        <w:ind w:left="720" w:hanging="360"/>
+      </w:pPr>
+      <w:rPr>
+        <w:rFonts w:ascii="Symbol" w:hAnsi="Symbol" w:hint="default"/>
+        <w:sz w:val="20"/>
+      </w:rPr>
+    </w:lvl>
+    <w:lvl w:ilvl="1" w:tentative="1">
+      <w:start w:val="1"/>
+      <w:numFmt w:val="bullet"/>
+      <w:lvlText w:val="o"/>
+      <w:lvlJc w:val="left"/>
+      <w:pPr>
+        <w:tabs>
+          <w:tab w:val="num" w:pos="1440"/>
+        </w:tabs>
+        <w:ind w:left="1440" w:hanging="360"/>
+      </w:pPr>
+      <w:rPr>
+        <w:rFonts w:ascii="Courier New" w:hAnsi="Courier New" w:hint="default"/>
+        <w:sz w:val="20"/>
+      </w:rPr>
+    </w:lvl>
+    <w:lvl w:ilvl="2" w:tentative="1">
+      <w:start w:val="1"/>
+      <w:numFmt w:val="bullet"/>
+      <w:lvlText w:val=""/>
+      <w:lvlJc w:val="left"/>
+      <w:pPr>
+        <w:tabs>
+          <w:tab w:val="num" w:pos="2160"/>
+        </w:tabs>
+        <w:ind w:left="2160" w:hanging="360"/>
+      </w:pPr>
+      <w:rPr>
+        <w:rFonts w:ascii="Wingdings" w:hAnsi="Wingdings" w:hint="default"/>
+        <w:sz w:val="20"/>
+      </w:rPr>
+    </w:lvl>
+    <w:lvl w:ilvl="3" w:tentative="1">
+      <w:start w:val="1"/>
+      <w:numFmt w:val="bullet"/>
+      <w:lvlText w:val=""/>
+      <w:lvlJc w:val="left"/>
+      <w:pPr>
+        <w:tabs>
+          <w:tab w:val="num" w:pos="2880"/>
+        </w:tabs>
+        <w:ind w:left="2880" w:hanging="360"/>
+      </w:pPr>
+      <w:rPr>
+        <w:rFonts w:ascii="Wingdings" w:hAnsi="Wingdings" w:hint="default"/>
+        <w:sz w:val="20"/>
+      </w:rPr>
+    </w:lvl>
+    <w:lvl w:ilvl="4" w:tentative="1">
+      <w:start w:val="1"/>
+      <w:numFmt w:val="bullet"/>
+      <w:lvlText w:val=""/>
+      <w:lvlJc w:val="left"/>
+      <w:pPr>
+        <w:tabs>
+          <w:tab w:val="num" w:pos="3600"/>
+        </w:tabs>
+        <w:ind w:left="3600" w:hanging="360"/>
+      </w:pPr>
+      <w:rPr>
+        <w:rFonts w:ascii="Wingdings" w:hAnsi="Wingdings" w:hint="default"/>
+        <w:sz w:val="20"/>
+      </w:rPr>
+    </w:lvl>
+    <w:lvl w:ilvl="5" w:tentative="1">
+      <w:start w:val="1"/>
+      <w:numFmt w:val="bullet"/>
+      <w:lvlText w:val=""/>
+      <w:lvlJc w:val="left"/>
+      <w:pPr>
+        <w:tabs>
+          <w:tab w:val="num" w:pos="4320"/>
+        </w:tabs>
+        <w:ind w:left="4320" w:hanging="360"/>
+      </w:pPr>
+      <w:rPr>
+        <w:rFonts w:ascii="Wingdings" w:hAnsi="Wingdings" w:hint="default"/>
+        <w:sz w:val="20"/>
+      </w:rPr>
+    </w:lvl>
+    <w:lvl w:ilvl="6" w:tentative="1">
+      <w:start w:val="1"/>
+      <w:numFmt w:val="bullet"/>
+      <w:lvlText w:val=""/>
+      <w:lvlJc w:val="left"/>
+      <w:pPr>
+        <w:tabs>
+          <w:tab w:val="num" w:pos="5040"/>
+        </w:tabs>
+        <w:ind w:left="5040" w:hanging="360"/>
+      </w:pPr>
+      <w:rPr>
+        <w:rFonts w:ascii="Wingdings" w:hAnsi="Wingdings" w:hint="default"/>
+        <w:sz w:val="20"/>
+      </w:rPr>
+    </w:lvl>
+    <w:lvl w:ilvl="7" w:tentative="1">
+      <w:start w:val="1"/>
+      <w:numFmt w:val="bullet"/>
+      <w:lvlText w:val=""/>
+      <w:lvlJc w:val="left"/>
+      <w:pPr>
+        <w:tabs>
+          <w:tab w:val="num" w:pos="5760"/>
+        </w:tabs>
+        <w:ind w:left="5760" w:hanging="360"/>
+      </w:pPr>
+      <w:rPr>
+        <w:rFonts w:ascii="Wingdings" w:hAnsi="Wingdings" w:hint="default"/>
+        <w:sz w:val="20"/>
+      </w:rPr>
+    </w:lvl>
+    <w:lvl w:ilvl="8" w:tentative="1">
+      <w:start w:val="1"/>
+      <w:numFmt w:val="bullet"/>
+      <w:lvlText w:val=""/>
+      <w:lvlJc w:val="left"/>
+      <w:pPr>
+        <w:tabs>
+          <w:tab w:val="num" w:pos="6480"/>
+        </w:tabs>
+        <w:ind w:left="6480" w:hanging="360"/>
+      </w:pPr>
+      <w:rPr>
+        <w:rFonts w:ascii="Wingdings" w:hAnsi="Wingdings" w:hint="default"/>
+        <w:sz w:val="20"/>
+      </w:rPr>
+    </w:lvl>
+  </w:abstractNum>
+  <w:abstractNum w:abstractNumId="3" w15:restartNumberingAfterBreak="0">
     <w:nsid w:val="39C15513"/>
     <w:multiLevelType w:val="hybridMultilevel"/>
     <w:tmpl w:val="CE3A32CE"/>
@@ -1411,7 +2953,7 @@
       </w:pPr>
     </w:lvl>
   </w:abstractNum>
-  <w:abstractNum w:abstractNumId="3" w15:restartNumberingAfterBreak="0">
+  <w:abstractNum w:abstractNumId="4" w15:restartNumberingAfterBreak="0">
     <w:nsid w:val="68717457"/>
     <w:multiLevelType w:val="hybridMultilevel"/>
     <w:tmpl w:val="B5A87CEC"/>
@@ -1525,7 +3067,7 @@
     </w:lvl>
   </w:abstractNum>
   <w:num w:numId="1">
-    <w:abstractNumId w:val="2"/>
+    <w:abstractNumId w:val="3"/>
   </w:num>
   <w:num w:numId="2">
     <w:abstractNumId w:val="1"/>
@@ -1534,13 +3076,16 @@
     <w:abstractNumId w:val="0"/>
   </w:num>
   <w:num w:numId="4">
-    <w:abstractNumId w:val="3"/>
+    <w:abstractNumId w:val="4"/>
+  </w:num>
+  <w:num w:numId="5">
+    <w:abstractNumId w:val="2"/>
   </w:num>
 </w:numbering>
 </file>
 
 <file path=word/styles.xml><?xml version="1.0" encoding="utf-8"?>
-<w:styles xmlns:mc="http://schemas.openxmlformats.org/markup-compatibility/2006" xmlns:r="http://schemas.openxmlformats.org/officeDocument/2006/relationships" xmlns:w="http://schemas.openxmlformats.org/wordprocessingml/2006/main" xmlns:w14="http://schemas.microsoft.com/office/word/2010/wordml" xmlns:w15="http://schemas.microsoft.com/office/word/2012/wordml" xmlns:w16se="http://schemas.microsoft.com/office/word/2015/wordml/symex" mc:Ignorable="w14 w15 w16se">
+<w:styles xmlns:mc="http://schemas.openxmlformats.org/markup-compatibility/2006" xmlns:r="http://schemas.openxmlformats.org/officeDocument/2006/relationships" xmlns:w="http://schemas.openxmlformats.org/wordprocessingml/2006/main" xmlns:w14="http://schemas.microsoft.com/office/word/2010/wordml" xmlns:w15="http://schemas.microsoft.com/office/word/2012/wordml" xmlns:w16cid="http://schemas.microsoft.com/office/word/2016/wordml/cid" xmlns:w16se="http://schemas.microsoft.com/office/word/2015/wordml/symex" mc:Ignorable="w14 w15 w16se w16cid">
   <w:docDefaults>
     <w:rPrDefault>
       <w:rPr>
@@ -1556,7 +3101,7 @@
       </w:pPr>
     </w:pPrDefault>
   </w:docDefaults>
-  <w:latentStyles w:defLockedState="0" w:defUIPriority="99" w:defSemiHidden="0" w:defUnhideWhenUsed="0" w:defQFormat="0" w:count="371">
+  <w:latentStyles w:defLockedState="0" w:defUIPriority="99" w:defSemiHidden="0" w:defUnhideWhenUsed="0" w:defQFormat="0" w:count="375">
     <w:lsdException w:name="Normal" w:uiPriority="0" w:qFormat="1"/>
     <w:lsdException w:name="heading 1" w:uiPriority="9" w:qFormat="1"/>
     <w:lsdException w:name="heading 2" w:semiHidden="1" w:uiPriority="9" w:unhideWhenUsed="1" w:qFormat="1"/>
@@ -1662,7 +3207,6 @@
     <w:lsdException w:name="HTML Sample" w:semiHidden="1" w:unhideWhenUsed="1"/>
     <w:lsdException w:name="HTML Typewriter" w:semiHidden="1" w:unhideWhenUsed="1"/>
     <w:lsdException w:name="HTML Variable" w:semiHidden="1" w:unhideWhenUsed="1"/>
-    <w:lsdException w:name="Normal Table" w:semiHidden="1" w:unhideWhenUsed="1"/>
     <w:lsdException w:name="annotation subject" w:semiHidden="1" w:unhideWhenUsed="1"/>
     <w:lsdException w:name="No List" w:semiHidden="1" w:unhideWhenUsed="1"/>
     <w:lsdException w:name="Outline List 1" w:semiHidden="1" w:unhideWhenUsed="1"/>
@@ -1706,10 +3250,8 @@
     <w:lsdException w:name="Table Elegant" w:semiHidden="1" w:unhideWhenUsed="1"/>
     <w:lsdException w:name="Table Professional" w:semiHidden="1" w:unhideWhenUsed="1"/>
     <w:lsdException w:name="Table Subtle 1" w:semiHidden="1" w:unhideWhenUsed="1"/>
-    <w:lsdException w:name="Table Subtle 2" w:semiHidden="1" w:unhideWhenUsed="1"/>
     <w:lsdException w:name="Table Web 1" w:semiHidden="1" w:unhideWhenUsed="1"/>
     <w:lsdException w:name="Table Web 2" w:semiHidden="1" w:unhideWhenUsed="1"/>
-    <w:lsdException w:name="Table Web 3" w:semiHidden="1" w:unhideWhenUsed="1"/>
     <w:lsdException w:name="Balloon Text" w:semiHidden="1" w:unhideWhenUsed="1"/>
     <w:lsdException w:name="Table Grid" w:uiPriority="39"/>
     <w:lsdException w:name="Table Theme" w:semiHidden="1" w:unhideWhenUsed="1"/>
@@ -1928,10 +3470,53 @@
     <w:lsdException w:name="List Table 5 Dark Accent 6" w:uiPriority="50"/>
     <w:lsdException w:name="List Table 6 Colorful Accent 6" w:uiPriority="51"/>
     <w:lsdException w:name="List Table 7 Colorful Accent 6" w:uiPriority="52"/>
+    <w:lsdException w:name="Mention" w:semiHidden="1" w:unhideWhenUsed="1"/>
+    <w:lsdException w:name="Smart Hyperlink" w:semiHidden="1" w:unhideWhenUsed="1"/>
+    <w:lsdException w:name="Hashtag" w:semiHidden="1" w:unhideWhenUsed="1"/>
+    <w:lsdException w:name="Unresolved Mention" w:semiHidden="1" w:unhideWhenUsed="1"/>
   </w:latentStyles>
   <w:style w:type="paragraph" w:default="1" w:styleId="Normal">
     <w:name w:val="Normal"/>
     <w:qFormat/>
+  </w:style>
+  <w:style w:type="paragraph" w:styleId="Heading1">
+    <w:name w:val="heading 1"/>
+    <w:basedOn w:val="Normal"/>
+    <w:link w:val="Heading1Char"/>
+    <w:uiPriority w:val="9"/>
+    <w:qFormat/>
+    <w:rsid w:val="00B4037C"/>
+    <w:pPr>
+      <w:spacing w:before="100" w:beforeAutospacing="1" w:after="100" w:afterAutospacing="1" w:line="240" w:lineRule="auto"/>
+      <w:outlineLvl w:val="0"/>
+    </w:pPr>
+    <w:rPr>
+      <w:rFonts w:ascii="Times New Roman" w:eastAsia="Times New Roman" w:hAnsi="Times New Roman" w:cs="Times New Roman"/>
+      <w:b/>
+      <w:bCs/>
+      <w:kern w:val="36"/>
+      <w:sz w:val="48"/>
+      <w:szCs w:val="48"/>
+    </w:rPr>
+  </w:style>
+  <w:style w:type="paragraph" w:styleId="Heading3">
+    <w:name w:val="heading 3"/>
+    <w:basedOn w:val="Normal"/>
+    <w:link w:val="Heading3Char"/>
+    <w:uiPriority w:val="9"/>
+    <w:qFormat/>
+    <w:rsid w:val="00B4037C"/>
+    <w:pPr>
+      <w:spacing w:before="100" w:beforeAutospacing="1" w:after="100" w:afterAutospacing="1" w:line="240" w:lineRule="auto"/>
+      <w:outlineLvl w:val="2"/>
+    </w:pPr>
+    <w:rPr>
+      <w:rFonts w:ascii="Times New Roman" w:eastAsia="Times New Roman" w:hAnsi="Times New Roman" w:cs="Times New Roman"/>
+      <w:b/>
+      <w:bCs/>
+      <w:sz w:val="27"/>
+      <w:szCs w:val="27"/>
+    </w:rPr>
   </w:style>
   <w:style w:type="character" w:default="1" w:styleId="DefaultParagraphFont">
     <w:name w:val="Default Paragraph Font"/>
@@ -1971,7 +3556,185 @@
       <w:contextualSpacing/>
     </w:pPr>
   </w:style>
+  <w:style w:type="character" w:customStyle="1" w:styleId="Heading1Char">
+    <w:name w:val="Heading 1 Char"/>
+    <w:basedOn w:val="DefaultParagraphFont"/>
+    <w:link w:val="Heading1"/>
+    <w:uiPriority w:val="9"/>
+    <w:rsid w:val="00B4037C"/>
+    <w:rPr>
+      <w:rFonts w:ascii="Times New Roman" w:eastAsia="Times New Roman" w:hAnsi="Times New Roman" w:cs="Times New Roman"/>
+      <w:b/>
+      <w:bCs/>
+      <w:kern w:val="36"/>
+      <w:sz w:val="48"/>
+      <w:szCs w:val="48"/>
+    </w:rPr>
+  </w:style>
+  <w:style w:type="character" w:customStyle="1" w:styleId="Heading3Char">
+    <w:name w:val="Heading 3 Char"/>
+    <w:basedOn w:val="DefaultParagraphFont"/>
+    <w:link w:val="Heading3"/>
+    <w:uiPriority w:val="9"/>
+    <w:rsid w:val="00B4037C"/>
+    <w:rPr>
+      <w:rFonts w:ascii="Times New Roman" w:eastAsia="Times New Roman" w:hAnsi="Times New Roman" w:cs="Times New Roman"/>
+      <w:b/>
+      <w:bCs/>
+      <w:sz w:val="27"/>
+      <w:szCs w:val="27"/>
+    </w:rPr>
+  </w:style>
+  <w:style w:type="paragraph" w:styleId="NormalWeb">
+    <w:name w:val="Normal (Web)"/>
+    <w:basedOn w:val="Normal"/>
+    <w:uiPriority w:val="99"/>
+    <w:semiHidden/>
+    <w:unhideWhenUsed/>
+    <w:rsid w:val="00B4037C"/>
+    <w:pPr>
+      <w:spacing w:before="100" w:beforeAutospacing="1" w:after="100" w:afterAutospacing="1" w:line="240" w:lineRule="auto"/>
+    </w:pPr>
+    <w:rPr>
+      <w:rFonts w:ascii="Times New Roman" w:eastAsia="Times New Roman" w:hAnsi="Times New Roman" w:cs="Times New Roman"/>
+      <w:sz w:val="24"/>
+      <w:szCs w:val="24"/>
+    </w:rPr>
+  </w:style>
+  <w:style w:type="paragraph" w:customStyle="1" w:styleId="task-list-item">
+    <w:name w:val="task-list-item"/>
+    <w:basedOn w:val="Normal"/>
+    <w:rsid w:val="00B4037C"/>
+    <w:pPr>
+      <w:spacing w:before="100" w:beforeAutospacing="1" w:after="100" w:afterAutospacing="1" w:line="240" w:lineRule="auto"/>
+    </w:pPr>
+    <w:rPr>
+      <w:rFonts w:ascii="Times New Roman" w:eastAsia="Times New Roman" w:hAnsi="Times New Roman" w:cs="Times New Roman"/>
+      <w:sz w:val="24"/>
+      <w:szCs w:val="24"/>
+    </w:rPr>
+  </w:style>
+  <w:style w:type="character" w:styleId="HTMLCode">
+    <w:name w:val="HTML Code"/>
+    <w:basedOn w:val="DefaultParagraphFont"/>
+    <w:uiPriority w:val="99"/>
+    <w:semiHidden/>
+    <w:unhideWhenUsed/>
+    <w:rsid w:val="00B4037C"/>
+    <w:rPr>
+      <w:rFonts w:ascii="Courier New" w:eastAsia="Times New Roman" w:hAnsi="Courier New" w:cs="Courier New"/>
+      <w:sz w:val="20"/>
+      <w:szCs w:val="20"/>
+    </w:rPr>
+  </w:style>
+  <w:style w:type="character" w:styleId="Strong">
+    <w:name w:val="Strong"/>
+    <w:basedOn w:val="DefaultParagraphFont"/>
+    <w:uiPriority w:val="22"/>
+    <w:qFormat/>
+    <w:rsid w:val="00B4037C"/>
+    <w:rPr>
+      <w:b/>
+      <w:bCs/>
+    </w:rPr>
+  </w:style>
+  <w:style w:type="paragraph" w:styleId="HTMLPreformatted">
+    <w:name w:val="HTML Preformatted"/>
+    <w:basedOn w:val="Normal"/>
+    <w:link w:val="HTMLPreformattedChar"/>
+    <w:uiPriority w:val="99"/>
+    <w:semiHidden/>
+    <w:unhideWhenUsed/>
+    <w:rsid w:val="00B4037C"/>
+    <w:pPr>
+      <w:tabs>
+        <w:tab w:val="left" w:pos="916"/>
+        <w:tab w:val="left" w:pos="1832"/>
+        <w:tab w:val="left" w:pos="2748"/>
+        <w:tab w:val="left" w:pos="3664"/>
+        <w:tab w:val="left" w:pos="4580"/>
+        <w:tab w:val="left" w:pos="5496"/>
+        <w:tab w:val="left" w:pos="6412"/>
+        <w:tab w:val="left" w:pos="7328"/>
+        <w:tab w:val="left" w:pos="8244"/>
+        <w:tab w:val="left" w:pos="9160"/>
+        <w:tab w:val="left" w:pos="10076"/>
+        <w:tab w:val="left" w:pos="10992"/>
+        <w:tab w:val="left" w:pos="11908"/>
+        <w:tab w:val="left" w:pos="12824"/>
+        <w:tab w:val="left" w:pos="13740"/>
+        <w:tab w:val="left" w:pos="14656"/>
+      </w:tabs>
+      <w:spacing w:after="0" w:line="240" w:lineRule="auto"/>
+    </w:pPr>
+    <w:rPr>
+      <w:rFonts w:ascii="Courier New" w:eastAsia="Times New Roman" w:hAnsi="Courier New" w:cs="Courier New"/>
+      <w:sz w:val="20"/>
+      <w:szCs w:val="20"/>
+    </w:rPr>
+  </w:style>
+  <w:style w:type="character" w:customStyle="1" w:styleId="HTMLPreformattedChar">
+    <w:name w:val="HTML Preformatted Char"/>
+    <w:basedOn w:val="DefaultParagraphFont"/>
+    <w:link w:val="HTMLPreformatted"/>
+    <w:uiPriority w:val="99"/>
+    <w:semiHidden/>
+    <w:rsid w:val="00B4037C"/>
+    <w:rPr>
+      <w:rFonts w:ascii="Courier New" w:eastAsia="Times New Roman" w:hAnsi="Courier New" w:cs="Courier New"/>
+      <w:sz w:val="20"/>
+      <w:szCs w:val="20"/>
+    </w:rPr>
+  </w:style>
 </w:styles>
+</file>
+
+<file path=word/activeX/activeX1.xml><?xml version="1.0" encoding="utf-8"?>
+<ax:ocx xmlns:ax="http://schemas.microsoft.com/office/2006/activeX" xmlns:r="http://schemas.openxmlformats.org/officeDocument/2006/relationships" ax:classid="{5512D116-5CC6-11CF-8D67-00AA00BDCE1D}" ax:persistence="persistStream" r:id="rId1"/>
+</file>
+
+<file path=word/activeX/activeX10.xml><?xml version="1.0" encoding="utf-8"?>
+<ax:ocx xmlns:ax="http://schemas.microsoft.com/office/2006/activeX" xmlns:r="http://schemas.openxmlformats.org/officeDocument/2006/relationships" ax:classid="{5512D116-5CC6-11CF-8D67-00AA00BDCE1D}" ax:persistence="persistStream" r:id="rId1"/>
+</file>
+
+<file path=word/activeX/activeX11.xml><?xml version="1.0" encoding="utf-8"?>
+<ax:ocx xmlns:ax="http://schemas.microsoft.com/office/2006/activeX" xmlns:r="http://schemas.openxmlformats.org/officeDocument/2006/relationships" ax:classid="{5512D116-5CC6-11CF-8D67-00AA00BDCE1D}" ax:persistence="persistStream" r:id="rId1"/>
+</file>
+
+<file path=word/activeX/activeX12.xml><?xml version="1.0" encoding="utf-8"?>
+<ax:ocx xmlns:ax="http://schemas.microsoft.com/office/2006/activeX" xmlns:r="http://schemas.openxmlformats.org/officeDocument/2006/relationships" ax:classid="{5512D116-5CC6-11CF-8D67-00AA00BDCE1D}" ax:persistence="persistStream" r:id="rId1"/>
+</file>
+
+<file path=word/activeX/activeX2.xml><?xml version="1.0" encoding="utf-8"?>
+<ax:ocx xmlns:ax="http://schemas.microsoft.com/office/2006/activeX" xmlns:r="http://schemas.openxmlformats.org/officeDocument/2006/relationships" ax:classid="{5512D116-5CC6-11CF-8D67-00AA00BDCE1D}" ax:persistence="persistStream" r:id="rId1"/>
+</file>
+
+<file path=word/activeX/activeX3.xml><?xml version="1.0" encoding="utf-8"?>
+<ax:ocx xmlns:ax="http://schemas.microsoft.com/office/2006/activeX" xmlns:r="http://schemas.openxmlformats.org/officeDocument/2006/relationships" ax:classid="{5512D116-5CC6-11CF-8D67-00AA00BDCE1D}" ax:persistence="persistStream" r:id="rId1"/>
+</file>
+
+<file path=word/activeX/activeX4.xml><?xml version="1.0" encoding="utf-8"?>
+<ax:ocx xmlns:ax="http://schemas.microsoft.com/office/2006/activeX" xmlns:r="http://schemas.openxmlformats.org/officeDocument/2006/relationships" ax:classid="{5512D116-5CC6-11CF-8D67-00AA00BDCE1D}" ax:persistence="persistStream" r:id="rId1"/>
+</file>
+
+<file path=word/activeX/activeX5.xml><?xml version="1.0" encoding="utf-8"?>
+<ax:ocx xmlns:ax="http://schemas.microsoft.com/office/2006/activeX" xmlns:r="http://schemas.openxmlformats.org/officeDocument/2006/relationships" ax:classid="{5512D116-5CC6-11CF-8D67-00AA00BDCE1D}" ax:persistence="persistStream" r:id="rId1"/>
+</file>
+
+<file path=word/activeX/activeX6.xml><?xml version="1.0" encoding="utf-8"?>
+<ax:ocx xmlns:ax="http://schemas.microsoft.com/office/2006/activeX" xmlns:r="http://schemas.openxmlformats.org/officeDocument/2006/relationships" ax:classid="{5512D116-5CC6-11CF-8D67-00AA00BDCE1D}" ax:persistence="persistStream" r:id="rId1"/>
+</file>
+
+<file path=word/activeX/activeX7.xml><?xml version="1.0" encoding="utf-8"?>
+<ax:ocx xmlns:ax="http://schemas.microsoft.com/office/2006/activeX" xmlns:r="http://schemas.openxmlformats.org/officeDocument/2006/relationships" ax:classid="{5512D116-5CC6-11CF-8D67-00AA00BDCE1D}" ax:persistence="persistStream" r:id="rId1"/>
+</file>
+
+<file path=word/activeX/activeX8.xml><?xml version="1.0" encoding="utf-8"?>
+<ax:ocx xmlns:ax="http://schemas.microsoft.com/office/2006/activeX" xmlns:r="http://schemas.openxmlformats.org/officeDocument/2006/relationships" ax:classid="{5512D116-5CC6-11CF-8D67-00AA00BDCE1D}" ax:persistence="persistStream" r:id="rId1"/>
+</file>
+
+<file path=word/activeX/activeX9.xml><?xml version="1.0" encoding="utf-8"?>
+<ax:ocx xmlns:ax="http://schemas.microsoft.com/office/2006/activeX" xmlns:r="http://schemas.openxmlformats.org/officeDocument/2006/relationships" ax:classid="{5512D116-5CC6-11CF-8D67-00AA00BDCE1D}" ax:persistence="persistStream" r:id="rId1"/>
 </file>
 
 <file path=word/theme/theme1.xml><?xml version="1.0" encoding="utf-8"?>

</xml_diff>